<commit_message>
Finalize HW03 LaTeX submission package
</commit_message>
<xml_diff>
--- a/03/docs/answer/answer.docx
+++ b/03/docs/answer/answer.docx
@@ -318,7 +318,7 @@
         </w:tc>
       </w:tr>
     </w:tbl>
-    <w:bookmarkStart w:id="32" w:name="i.-二次方程小根的相消误差分析"/>
+    <w:bookmarkStart w:id="29" w:name="i.-二次方程小根的相消误差分析"/>
     <w:p>
       <w:pPr>
         <w:pStyle w:val="Heading1"/>
@@ -717,7 +717,7 @@
         <w:t xml:space="preserve">的计算将涉及两个接近量之间的相减。</w:t>
       </w:r>
     </w:p>
-    <w:bookmarkStart w:id="18" w:name="problem-11b100-附近的误差考察"/>
+    <w:bookmarkStart w:id="17" w:name="problem-11b100-附近的误差考察"/>
     <w:p>
       <w:pPr>
         <w:pStyle w:val="Heading2"/>
@@ -1021,7 +1021,7 @@
       </w:r>
     </w:p>
     <w:bookmarkEnd w:id="15"/>
-    <w:bookmarkStart w:id="16" w:name="问题答案"/>
+    <w:bookmarkStart w:id="16" w:name="答案"/>
     <w:p>
       <w:pPr>
         <w:pStyle w:val="Heading3"/>
@@ -1039,7 +1039,7 @@
         <w:rPr>
           <w:rFonts w:hint="eastAsia"/>
         </w:rPr>
-        <w:t xml:space="preserve">问题答案</w:t>
+        <w:t xml:space="preserve">答案</w:t>
       </w:r>
     </w:p>
     <w:p>
@@ -1334,31 +1334,9 @@
         <w:t xml:space="preserve">的主计算结果。</w:t>
       </w:r>
     </w:p>
-    <w:bookmarkEnd w:id="16"/>
-    <w:bookmarkStart w:id="17" w:name="分析"/>
-    <w:p>
-      <w:pPr>
-        <w:pStyle w:val="Heading3"/>
-      </w:pPr>
-      <w:r>
-        <w:rPr>
-          <w:rStyle w:val="SectionNumber"/>
-        </w:rPr>
-        <w:t xml:space="preserve">0.1.4</w:t>
-      </w:r>
-      <w:r>
-        <w:tab/>
-      </w:r>
-      <w:r>
-        <w:rPr>
-          <w:rFonts w:hint="eastAsia"/>
-        </w:rPr>
-        <w:t xml:space="preserve">分析</w:t>
-      </w:r>
-    </w:p>
-    <w:p>
-      <w:pPr>
-        <w:pStyle w:val="FirstParagraph"/>
+    <w:p>
+      <w:pPr>
+        <w:pStyle w:val="BodyText"/>
       </w:pPr>
       <w:r>
         <w:rPr>
@@ -1609,9 +1587,9 @@
         <w:t xml:space="preserve">再处理。</w:t>
       </w:r>
     </w:p>
+    <w:bookmarkEnd w:id="16"/>
     <w:bookmarkEnd w:id="17"/>
-    <w:bookmarkEnd w:id="18"/>
-    <w:bookmarkStart w:id="23" w:name="problem-12大参数区间的误差比较"/>
+    <w:bookmarkStart w:id="21" w:name="problem-12大参数区间的误差比较"/>
     <w:p>
       <w:pPr>
         <w:pStyle w:val="Heading2"/>
@@ -1687,7 +1665,7 @@
         </w:r>
       </w:hyperlink>
     </w:p>
-    <w:bookmarkStart w:id="19" w:name="待求问题-1"/>
+    <w:bookmarkStart w:id="18" w:name="待求问题-1"/>
     <w:p>
       <w:pPr>
         <w:pStyle w:val="Heading3"/>
@@ -1736,8 +1714,180 @@
         <w:t xml:space="preserve">取值并列表比较误差变化。</w:t>
       </w:r>
     </w:p>
+    <w:bookmarkEnd w:id="18"/>
+    <w:bookmarkStart w:id="19" w:name="解决方式-1"/>
+    <w:p>
+      <w:pPr>
+        <w:pStyle w:val="Heading3"/>
+      </w:pPr>
+      <w:r>
+        <w:rPr>
+          <w:rStyle w:val="SectionNumber"/>
+        </w:rPr>
+        <w:t xml:space="preserve">0.2.2</w:t>
+      </w:r>
+      <w:r>
+        <w:tab/>
+      </w:r>
+      <w:r>
+        <w:rPr>
+          <w:rFonts w:hint="eastAsia"/>
+        </w:rPr>
+        <w:t xml:space="preserve">解决方式</w:t>
+      </w:r>
+    </w:p>
+    <w:p>
+      <w:pPr>
+        <w:pStyle w:val="FirstParagraph"/>
+      </w:pPr>
+      <w:r>
+        <w:rPr>
+          <w:rFonts w:hint="eastAsia"/>
+        </w:rPr>
+        <w:t xml:space="preserve">为使实验步骤表达得更规范，本文以伪代码方式给出求解过程：</w:t>
+      </w:r>
+    </w:p>
+    <w:p>
+      <w:pPr>
+        <w:pStyle w:val="SourceCode"/>
+      </w:pPr>
+      <w:r>
+        <w:rPr>
+          <w:rStyle w:val="VerbatimChar"/>
+        </w:rPr>
+        <w:t xml:space="preserve">Input : precisions P, test values B</w:t>
+      </w:r>
+      <w:r>
+        <w:br/>
+      </w:r>
+      <w:r>
+        <w:rPr>
+          <w:rStyle w:val="VerbatimChar"/>
+        </w:rPr>
+        <w:t xml:space="preserve">Output: standard-form error table</w:t>
+      </w:r>
+      <w:r>
+        <w:br/>
+      </w:r>
+      <w:r>
+        <w:br/>
+      </w:r>
+      <w:r>
+        <w:rPr>
+          <w:rStyle w:val="VerbatimChar"/>
+        </w:rPr>
+        <w:t xml:space="preserve">for each p in P do</w:t>
+      </w:r>
+      <w:r>
+        <w:br/>
+      </w:r>
+      <w:r>
+        <w:rPr>
+          <w:rStyle w:val="VerbatimChar"/>
+        </w:rPr>
+        <w:t xml:space="preserve">    for each b in B do</w:t>
+      </w:r>
+      <w:r>
+        <w:br/>
+      </w:r>
+      <w:r>
+        <w:rPr>
+          <w:rStyle w:val="VerbatimChar"/>
+        </w:rPr>
+        <w:t xml:space="preserve">        r &lt;- sqrt(b^2 - 4)</w:t>
+      </w:r>
+      <w:r>
+        <w:br/>
+      </w:r>
+      <w:r>
+        <w:rPr>
+          <w:rStyle w:val="VerbatimChar"/>
+        </w:rPr>
+        <w:t xml:space="preserve">        x_std &lt;- (b - r) / 2</w:t>
+      </w:r>
+      <w:r>
+        <w:br/>
+      </w:r>
+      <w:r>
+        <w:rPr>
+          <w:rStyle w:val="VerbatimChar"/>
+        </w:rPr>
+        <w:t xml:space="preserve">        x_ref &lt;- ref_root(b)</w:t>
+      </w:r>
+      <w:r>
+        <w:br/>
+      </w:r>
+      <w:r>
+        <w:rPr>
+          <w:rStyle w:val="VerbatimChar"/>
+        </w:rPr>
+        <w:t xml:space="preserve">        err_std &lt;- relerr(x_std, x_ref)</w:t>
+      </w:r>
+      <w:r>
+        <w:br/>
+      </w:r>
+      <w:r>
+        <w:rPr>
+          <w:rStyle w:val="VerbatimChar"/>
+        </w:rPr>
+        <w:t xml:space="preserve">    end for</w:t>
+      </w:r>
+      <w:r>
+        <w:br/>
+      </w:r>
+      <w:r>
+        <w:rPr>
+          <w:rStyle w:val="VerbatimChar"/>
+        </w:rPr>
+        <w:t xml:space="preserve">end for</w:t>
+      </w:r>
+    </w:p>
+    <w:p>
+      <w:pPr>
+        <w:pStyle w:val="FirstParagraph"/>
+      </w:pPr>
+      <w:r>
+        <w:rPr>
+          <w:rFonts w:hint="eastAsia"/>
+        </w:rPr>
+        <w:t xml:space="preserve">其中</w:t>
+      </w:r>
+      <w:r>
+        <w:t xml:space="preserve"> </w:t>
+      </w:r>
+      <w:r>
+        <w:rPr>
+          <w:rStyle w:val="VerbatimChar"/>
+        </w:rPr>
+        <w:t xml:space="preserve">ref_root(b)</w:t>
+      </w:r>
+      <w:r>
+        <w:t xml:space="preserve"> </w:t>
+      </w:r>
+      <w:r>
+        <w:rPr>
+          <w:rFonts w:hint="eastAsia"/>
+        </w:rPr>
+        <w:t xml:space="preserve">表示高精度参考解，</w:t>
+      </w:r>
+      <w:r>
+        <w:rPr>
+          <w:rStyle w:val="VerbatimChar"/>
+        </w:rPr>
+        <w:t xml:space="preserve">relerr</w:t>
+      </w:r>
+      <w:r>
+        <w:t xml:space="preserve"> </w:t>
+      </w:r>
+      <w:r>
+        <w:rPr>
+          <w:rFonts w:hint="eastAsia"/>
+        </w:rPr>
+        <w:t xml:space="preserve">表示相对误差计算函数。</w:t>
+      </w:r>
+    </w:p>
     <w:bookmarkEnd w:id="19"/>
-    <w:bookmarkStart w:id="20" w:name="解决方式-1"/>
+    <w:bookmarkStart w:id="20" w:name="答案-1"/>
     <w:p>
       <w:pPr>
         <w:pStyle w:val="Heading3"/>
@@ -1746,7 +1896,7 @@
         <w:rPr>
           <w:rStyle w:val="SectionNumber"/>
         </w:rPr>
-        <w:t xml:space="preserve">0.2.2</w:t>
+        <w:t xml:space="preserve">0.2.3</w:t>
       </w:r>
       <w:r>
         <w:tab/>
@@ -1755,179 +1905,7 @@
         <w:rPr>
           <w:rFonts w:hint="eastAsia"/>
         </w:rPr>
-        <w:t xml:space="preserve">解决方式</w:t>
-      </w:r>
-    </w:p>
-    <w:p>
-      <w:pPr>
-        <w:pStyle w:val="FirstParagraph"/>
-      </w:pPr>
-      <w:r>
-        <w:rPr>
-          <w:rFonts w:hint="eastAsia"/>
-        </w:rPr>
-        <w:t xml:space="preserve">为使实验步骤表达得更规范，本文以伪代码方式给出求解过程：</w:t>
-      </w:r>
-    </w:p>
-    <w:p>
-      <w:pPr>
-        <w:pStyle w:val="SourceCode"/>
-      </w:pPr>
-      <w:r>
-        <w:rPr>
-          <w:rStyle w:val="VerbatimChar"/>
-        </w:rPr>
-        <w:t xml:space="preserve">Input : precisions P, test values B</w:t>
-      </w:r>
-      <w:r>
-        <w:br/>
-      </w:r>
-      <w:r>
-        <w:rPr>
-          <w:rStyle w:val="VerbatimChar"/>
-        </w:rPr>
-        <w:t xml:space="preserve">Output: standard-form error table</w:t>
-      </w:r>
-      <w:r>
-        <w:br/>
-      </w:r>
-      <w:r>
-        <w:br/>
-      </w:r>
-      <w:r>
-        <w:rPr>
-          <w:rStyle w:val="VerbatimChar"/>
-        </w:rPr>
-        <w:t xml:space="preserve">for each p in P do</w:t>
-      </w:r>
-      <w:r>
-        <w:br/>
-      </w:r>
-      <w:r>
-        <w:rPr>
-          <w:rStyle w:val="VerbatimChar"/>
-        </w:rPr>
-        <w:t xml:space="preserve">    for each b in B do</w:t>
-      </w:r>
-      <w:r>
-        <w:br/>
-      </w:r>
-      <w:r>
-        <w:rPr>
-          <w:rStyle w:val="VerbatimChar"/>
-        </w:rPr>
-        <w:t xml:space="preserve">        r &lt;- sqrt(b^2 - 4)</w:t>
-      </w:r>
-      <w:r>
-        <w:br/>
-      </w:r>
-      <w:r>
-        <w:rPr>
-          <w:rStyle w:val="VerbatimChar"/>
-        </w:rPr>
-        <w:t xml:space="preserve">        x_std &lt;- (b - r) / 2</w:t>
-      </w:r>
-      <w:r>
-        <w:br/>
-      </w:r>
-      <w:r>
-        <w:rPr>
-          <w:rStyle w:val="VerbatimChar"/>
-        </w:rPr>
-        <w:t xml:space="preserve">        x_ref &lt;- ref_root(b)</w:t>
-      </w:r>
-      <w:r>
-        <w:br/>
-      </w:r>
-      <w:r>
-        <w:rPr>
-          <w:rStyle w:val="VerbatimChar"/>
-        </w:rPr>
-        <w:t xml:space="preserve">        err_std &lt;- relerr(x_std, x_ref)</w:t>
-      </w:r>
-      <w:r>
-        <w:br/>
-      </w:r>
-      <w:r>
-        <w:rPr>
-          <w:rStyle w:val="VerbatimChar"/>
-        </w:rPr>
-        <w:t xml:space="preserve">    end for</w:t>
-      </w:r>
-      <w:r>
-        <w:br/>
-      </w:r>
-      <w:r>
-        <w:rPr>
-          <w:rStyle w:val="VerbatimChar"/>
-        </w:rPr>
-        <w:t xml:space="preserve">end for</w:t>
-      </w:r>
-    </w:p>
-    <w:p>
-      <w:pPr>
-        <w:pStyle w:val="FirstParagraph"/>
-      </w:pPr>
-      <w:r>
-        <w:rPr>
-          <w:rFonts w:hint="eastAsia"/>
-        </w:rPr>
-        <w:t xml:space="preserve">其中</w:t>
-      </w:r>
-      <w:r>
-        <w:t xml:space="preserve"> </w:t>
-      </w:r>
-      <w:r>
-        <w:rPr>
-          <w:rStyle w:val="VerbatimChar"/>
-        </w:rPr>
-        <w:t xml:space="preserve">ref_root(b)</w:t>
-      </w:r>
-      <w:r>
-        <w:t xml:space="preserve"> </w:t>
-      </w:r>
-      <w:r>
-        <w:rPr>
-          <w:rFonts w:hint="eastAsia"/>
-        </w:rPr>
-        <w:t xml:space="preserve">表示高精度参考解，</w:t>
-      </w:r>
-      <w:r>
-        <w:rPr>
-          <w:rStyle w:val="VerbatimChar"/>
-        </w:rPr>
-        <w:t xml:space="preserve">relerr</w:t>
-      </w:r>
-      <w:r>
-        <w:t xml:space="preserve"> </w:t>
-      </w:r>
-      <w:r>
-        <w:rPr>
-          <w:rFonts w:hint="eastAsia"/>
-        </w:rPr>
-        <w:t xml:space="preserve">表示相对误差计算函数。</w:t>
-      </w:r>
-    </w:p>
-    <w:bookmarkEnd w:id="20"/>
-    <w:bookmarkStart w:id="21" w:name="问题答案-1"/>
-    <w:p>
-      <w:pPr>
-        <w:pStyle w:val="Heading3"/>
-      </w:pPr>
-      <w:r>
-        <w:rPr>
-          <w:rStyle w:val="SectionNumber"/>
-        </w:rPr>
-        <w:t xml:space="preserve">0.2.3</w:t>
-      </w:r>
-      <w:r>
-        <w:tab/>
-      </w:r>
-      <w:r>
-        <w:rPr>
-          <w:rFonts w:hint="eastAsia"/>
-        </w:rPr>
-        <w:t xml:space="preserve">问题答案</w:t>
+        <w:t xml:space="preserve">答案</w:t>
       </w:r>
     </w:p>
     <w:p>
@@ -2423,31 +2401,9 @@
         <w:t xml:space="preserve">的误差量级。</w:t>
       </w:r>
     </w:p>
-    <w:bookmarkEnd w:id="21"/>
-    <w:bookmarkStart w:id="22" w:name="分析-1"/>
-    <w:p>
-      <w:pPr>
-        <w:pStyle w:val="Heading3"/>
-      </w:pPr>
-      <w:r>
-        <w:rPr>
-          <w:rStyle w:val="SectionNumber"/>
-        </w:rPr>
-        <w:t xml:space="preserve">0.2.4</w:t>
-      </w:r>
-      <w:r>
-        <w:tab/>
-      </w:r>
-      <w:r>
-        <w:rPr>
-          <w:rFonts w:hint="eastAsia"/>
-        </w:rPr>
-        <w:t xml:space="preserve">分析</w:t>
-      </w:r>
-    </w:p>
-    <w:p>
-      <w:pPr>
-        <w:pStyle w:val="FirstParagraph"/>
+    <w:p>
+      <w:pPr>
+        <w:pStyle w:val="BodyText"/>
       </w:pPr>
       <w:r>
         <w:rPr>
@@ -2723,9 +2679,9 @@
         <w:t xml:space="preserve">值复现实验。</w:t>
       </w:r>
     </w:p>
-    <w:bookmarkEnd w:id="22"/>
-    <w:bookmarkEnd w:id="23"/>
-    <w:bookmarkStart w:id="31" w:name="problem-13有理化改写与再实验"/>
+    <w:bookmarkEnd w:id="20"/>
+    <w:bookmarkEnd w:id="21"/>
+    <w:bookmarkStart w:id="28" w:name="problem-13有理化改写与再实验"/>
     <w:p>
       <w:pPr>
         <w:pStyle w:val="Heading2"/>
@@ -2801,7 +2757,7 @@
         </w:r>
       </w:hyperlink>
     </w:p>
-    <w:bookmarkStart w:id="24" w:name="待求问题-2"/>
+    <w:bookmarkStart w:id="22" w:name="待求问题-2"/>
     <w:p>
       <w:pPr>
         <w:pStyle w:val="Heading3"/>
@@ -2994,8 +2950,8 @@
         <w:t xml:space="preserve">并重新进行同样的实验，以比较两种实现的稳定性差异。</w:t>
       </w:r>
     </w:p>
-    <w:bookmarkEnd w:id="24"/>
-    <w:bookmarkStart w:id="25" w:name="解决方式-2"/>
+    <w:bookmarkEnd w:id="22"/>
+    <w:bookmarkStart w:id="23" w:name="解决方式-2"/>
     <w:p>
       <w:pPr>
         <w:pStyle w:val="Heading3"/>
@@ -3184,8 +3140,8 @@
         <w:t xml:space="preserve">表示相对误差计算函数。</w:t>
       </w:r>
     </w:p>
-    <w:bookmarkEnd w:id="25"/>
-    <w:bookmarkStart w:id="29" w:name="问题答案-2"/>
+    <w:bookmarkEnd w:id="23"/>
+    <w:bookmarkStart w:id="27" w:name="答案-2"/>
     <w:p>
       <w:pPr>
         <w:pStyle w:val="Heading3"/>
@@ -3203,7 +3159,7 @@
         <w:rPr>
           <w:rFonts w:hint="eastAsia"/>
         </w:rPr>
-        <w:t xml:space="preserve">问题答案</w:t>
+        <w:t xml:space="preserve">答案</w:t>
       </w:r>
     </w:p>
     <w:p>
@@ -3243,18 +3199,18 @@
           <wp:inline>
             <wp:extent cx="4693920" cy="5632704"/>
             <wp:effectExtent b="0" l="0" r="0" t="0"/>
-            <wp:docPr descr="Problem 1 relative-error comparison after rationalization" title="" id="27" name="Picture"/>
+            <wp:docPr descr="Problem 1 relative-error comparison after rationalization" title="" id="25" name="Picture"/>
             <a:graphic>
               <a:graphicData uri="http://schemas.openxmlformats.org/drawingml/2006/picture">
                 <pic:pic>
                   <pic:nvPicPr>
-                    <pic:cNvPr descr="../../result/problem1_relative_error.png" id="28" name="Picture"/>
+                    <pic:cNvPr descr="../../result/problem1_relative_error.png" id="26" name="Picture"/>
                     <pic:cNvPicPr>
                       <a:picLocks noChangeArrowheads="1" noChangeAspect="1"/>
                     </pic:cNvPicPr>
                   </pic:nvPicPr>
                   <pic:blipFill>
-                    <a:blip r:embed="rId26"/>
+                    <a:blip r:embed="rId24"/>
                     <a:stretch>
                       <a:fillRect/>
                     </a:stretch>
@@ -3828,31 +3784,9 @@
         <w:t xml:space="preserve"> 1.0000E-20。</w:t>
       </w:r>
     </w:p>
-    <w:bookmarkEnd w:id="29"/>
-    <w:bookmarkStart w:id="30" w:name="分析-2"/>
-    <w:p>
-      <w:pPr>
-        <w:pStyle w:val="Heading3"/>
-      </w:pPr>
-      <w:r>
-        <w:rPr>
-          <w:rStyle w:val="SectionNumber"/>
-        </w:rPr>
-        <w:t xml:space="preserve">0.3.4</w:t>
-      </w:r>
-      <w:r>
-        <w:tab/>
-      </w:r>
-      <w:r>
-        <w:rPr>
-          <w:rFonts w:hint="eastAsia"/>
-        </w:rPr>
-        <w:t xml:space="preserve">分析</w:t>
-      </w:r>
-    </w:p>
-    <w:p>
-      <w:pPr>
-        <w:pStyle w:val="FirstParagraph"/>
+    <w:p>
+      <w:pPr>
+        <w:pStyle w:val="BodyText"/>
       </w:pPr>
       <w:r>
         <w:rPr>
@@ -4308,10 +4242,10 @@
         <w:t xml:space="preserve">得到小根。</w:t>
       </w:r>
     </w:p>
-    <w:bookmarkEnd w:id="30"/>
-    <w:bookmarkEnd w:id="31"/>
-    <w:bookmarkEnd w:id="32"/>
-    <w:bookmarkStart w:id="56" w:name="ii.-多项式写法对数值稳定性的影响"/>
+    <w:bookmarkEnd w:id="27"/>
+    <w:bookmarkEnd w:id="28"/>
+    <w:bookmarkEnd w:id="29"/>
+    <w:bookmarkStart w:id="50" w:name="ii.-多项式写法对数值稳定性的影响"/>
     <w:p>
       <w:pPr>
         <w:pStyle w:val="Heading1"/>
@@ -4505,7 +4439,7 @@
         <w:t xml:space="preserve">上观察数值结果。</w:t>
       </w:r>
     </w:p>
-    <w:bookmarkStart w:id="42" w:name="problem-21局部放大观察"/>
+    <w:bookmarkStart w:id="38" w:name="problem-21局部放大观察"/>
     <w:p>
       <w:pPr>
         <w:pStyle w:val="Heading2"/>
@@ -4548,7 +4482,7 @@
           <w:numId w:val="1004"/>
         </w:numPr>
       </w:pPr>
-      <w:hyperlink r:id="rId33">
+      <w:hyperlink r:id="rId30">
         <w:r>
           <w:rPr>
             <w:rStyle w:val="Hyperlink"/>
@@ -4572,7 +4506,7 @@
           <w:numId w:val="1004"/>
         </w:numPr>
       </w:pPr>
-      <w:hyperlink r:id="rId34">
+      <w:hyperlink r:id="rId31">
         <w:r>
           <w:rPr>
             <w:rStyle w:val="Hyperlink"/>
@@ -4581,7 +4515,7 @@
         </w:r>
       </w:hyperlink>
     </w:p>
-    <w:bookmarkStart w:id="35" w:name="待求问题-3"/>
+    <w:bookmarkStart w:id="32" w:name="待求问题-3"/>
     <w:p>
       <w:pPr>
         <w:pStyle w:val="Heading3"/>
@@ -4613,8 +4547,8 @@
         <w:t xml:space="preserve">比较直接形式与展开形式在局部区间上的数值表现。</w:t>
       </w:r>
     </w:p>
-    <w:bookmarkEnd w:id="35"/>
-    <w:bookmarkStart w:id="36" w:name="解决方式-3"/>
+    <w:bookmarkEnd w:id="32"/>
+    <w:bookmarkStart w:id="33" w:name="解决方式-3"/>
     <w:p>
       <w:pPr>
         <w:pStyle w:val="Heading3"/>
@@ -4812,8 +4746,8 @@
         <w:t xml:space="preserve">进一步统计最大误差、峰值位置与中位误差。</w:t>
       </w:r>
     </w:p>
-    <w:bookmarkEnd w:id="36"/>
-    <w:bookmarkStart w:id="40" w:name="问题答案-3"/>
+    <w:bookmarkEnd w:id="33"/>
+    <w:bookmarkStart w:id="37" w:name="答案-3"/>
     <w:p>
       <w:pPr>
         <w:pStyle w:val="Heading3"/>
@@ -4831,7 +4765,7 @@
         <w:rPr>
           <w:rFonts w:hint="eastAsia"/>
         </w:rPr>
-        <w:t xml:space="preserve">问题答案</w:t>
+        <w:t xml:space="preserve">答案</w:t>
       </w:r>
     </w:p>
     <w:p>
@@ -4889,18 +4823,18 @@
           <wp:inline>
             <wp:extent cx="4693920" cy="5120640"/>
             <wp:effectExtent b="0" l="0" r="0" t="0"/>
-            <wp:docPr descr="Problem 2 zoomed-value comparison" title="" id="38" name="Picture"/>
+            <wp:docPr descr="Problem 2 zoomed-value comparison" title="" id="35" name="Picture"/>
             <a:graphic>
               <a:graphicData uri="http://schemas.openxmlformats.org/drawingml/2006/picture">
                 <pic:pic>
                   <pic:nvPicPr>
-                    <pic:cNvPr descr="../../result/problem2_zoom.png" id="39" name="Picture"/>
+                    <pic:cNvPr descr="../../result/problem2_zoom.png" id="36" name="Picture"/>
                     <pic:cNvPicPr>
                       <a:picLocks noChangeArrowheads="1" noChangeAspect="1"/>
                     </pic:cNvPicPr>
                   </pic:nvPicPr>
                   <pic:blipFill>
-                    <a:blip r:embed="rId37"/>
+                    <a:blip r:embed="rId34"/>
                     <a:stretch>
                       <a:fillRect/>
                     </a:stretch>
@@ -5028,31 +4962,9 @@
         <w:t xml:space="preserve">极小；若先将多项式展开为多个数量级接近的项再相加减，就会显著放大舍入误差。</w:t>
       </w:r>
     </w:p>
-    <w:bookmarkEnd w:id="40"/>
-    <w:bookmarkStart w:id="41" w:name="分析-3"/>
-    <w:p>
-      <w:pPr>
-        <w:pStyle w:val="Heading3"/>
-      </w:pPr>
-      <w:r>
-        <w:rPr>
-          <w:rStyle w:val="SectionNumber"/>
-        </w:rPr>
-        <w:t xml:space="preserve">0.4.4</w:t>
-      </w:r>
-      <w:r>
-        <w:tab/>
-      </w:r>
-      <w:r>
-        <w:rPr>
-          <w:rFonts w:hint="eastAsia"/>
-        </w:rPr>
-        <w:t xml:space="preserve">分析</w:t>
-      </w:r>
-    </w:p>
-    <w:p>
-      <w:pPr>
-        <w:pStyle w:val="FirstParagraph"/>
+    <w:p>
+      <w:pPr>
+        <w:pStyle w:val="BodyText"/>
       </w:pPr>
       <w:r>
         <w:rPr>
@@ -5378,9 +5290,9 @@
         <w:t xml:space="preserve">的极小结果。局部放大图中展开式曲线偏离参考曲线，说明问题不在函数本身，而在表达式写法引入了大数相减。</w:t>
       </w:r>
     </w:p>
-    <w:bookmarkEnd w:id="41"/>
-    <w:bookmarkEnd w:id="42"/>
-    <w:bookmarkStart w:id="50" w:name="problem-22相对误差分布"/>
+    <w:bookmarkEnd w:id="37"/>
+    <w:bookmarkEnd w:id="38"/>
+    <w:bookmarkStart w:id="45" w:name="problem-22相对误差分布"/>
     <w:p>
       <w:pPr>
         <w:pStyle w:val="Heading2"/>
@@ -5423,7 +5335,7 @@
           <w:numId w:val="1005"/>
         </w:numPr>
       </w:pPr>
-      <w:hyperlink r:id="rId33">
+      <w:hyperlink r:id="rId30">
         <w:r>
           <w:rPr>
             <w:rStyle w:val="Hyperlink"/>
@@ -5447,7 +5359,7 @@
           <w:numId w:val="1005"/>
         </w:numPr>
       </w:pPr>
-      <w:hyperlink r:id="rId34">
+      <w:hyperlink r:id="rId31">
         <w:r>
           <w:rPr>
             <w:rStyle w:val="Hyperlink"/>
@@ -5456,7 +5368,7 @@
         </w:r>
       </w:hyperlink>
     </w:p>
-    <w:bookmarkStart w:id="43" w:name="待求问题-4"/>
+    <w:bookmarkStart w:id="39" w:name="待求问题-4"/>
     <w:p>
       <w:pPr>
         <w:pStyle w:val="Heading3"/>
@@ -5488,8 +5400,8 @@
         <w:t xml:space="preserve">绘制并比较误差分布。</w:t>
       </w:r>
     </w:p>
-    <w:bookmarkEnd w:id="43"/>
-    <w:bookmarkStart w:id="44" w:name="解决方式-4"/>
+    <w:bookmarkEnd w:id="39"/>
+    <w:bookmarkStart w:id="40" w:name="解决方式-4"/>
     <w:p>
       <w:pPr>
         <w:pStyle w:val="Heading3"/>
@@ -5687,8 +5599,8 @@
         <w:t xml:space="preserve">进一步统计最大误差、峰值位置与中位误差。</w:t>
       </w:r>
     </w:p>
-    <w:bookmarkEnd w:id="44"/>
-    <w:bookmarkStart w:id="48" w:name="问题答案-4"/>
+    <w:bookmarkEnd w:id="40"/>
+    <w:bookmarkStart w:id="44" w:name="答案-4"/>
     <w:p>
       <w:pPr>
         <w:pStyle w:val="Heading3"/>
@@ -5706,7 +5618,7 @@
         <w:rPr>
           <w:rFonts w:hint="eastAsia"/>
         </w:rPr>
-        <w:t xml:space="preserve">问题答案</w:t>
+        <w:t xml:space="preserve">答案</w:t>
       </w:r>
     </w:p>
     <w:p>
@@ -5814,18 +5726,18 @@
           <wp:inline>
             <wp:extent cx="5120640" cy="5234544"/>
             <wp:effectExtent b="0" l="0" r="0" t="0"/>
-            <wp:docPr descr="Problem 2 relative-error distribution" title="" id="46" name="Picture"/>
+            <wp:docPr descr="Problem 2 relative-error distribution" title="" id="42" name="Picture"/>
             <a:graphic>
               <a:graphicData uri="http://schemas.openxmlformats.org/drawingml/2006/picture">
                 <pic:pic>
                   <pic:nvPicPr>
-                    <pic:cNvPr descr="../../result/problem2_relative_error.png" id="47" name="Picture"/>
+                    <pic:cNvPr descr="../../result/problem2_relative_error.png" id="43" name="Picture"/>
                     <pic:cNvPicPr>
                       <a:picLocks noChangeArrowheads="1" noChangeAspect="1"/>
                     </pic:cNvPicPr>
                   </pic:nvPicPr>
                   <pic:blipFill>
-                    <a:blip r:embed="rId45"/>
+                    <a:blip r:embed="rId41"/>
                     <a:stretch>
                       <a:fillRect/>
                     </a:stretch>
@@ -6625,31 +6537,9 @@
         <w:t xml:space="preserve">1.2522E+4，说明表达式结构对稳定性的影响并不会因精度提升而完全消失。</w:t>
       </w:r>
     </w:p>
-    <w:bookmarkEnd w:id="48"/>
-    <w:bookmarkStart w:id="49" w:name="分析-4"/>
-    <w:p>
-      <w:pPr>
-        <w:pStyle w:val="Heading3"/>
-      </w:pPr>
-      <w:r>
-        <w:rPr>
-          <w:rStyle w:val="SectionNumber"/>
-        </w:rPr>
-        <w:t xml:space="preserve">0.5.4</w:t>
-      </w:r>
-      <w:r>
-        <w:tab/>
-      </w:r>
-      <w:r>
-        <w:rPr>
-          <w:rFonts w:hint="eastAsia"/>
-        </w:rPr>
-        <w:t xml:space="preserve">分析</w:t>
-      </w:r>
-    </w:p>
-    <w:p>
-      <w:pPr>
-        <w:pStyle w:val="FirstParagraph"/>
+    <w:p>
+      <w:pPr>
+        <w:pStyle w:val="BodyText"/>
       </w:pPr>
       <w:r>
         <w:rPr>
@@ -7122,9 +7012,9 @@
         <w:t xml:space="preserve">1.7450E+31。图中的针状峰因此是相对误差定义和采样点共同造成的结果，不应理解为原函数出现了真实间断。</w:t>
       </w:r>
     </w:p>
-    <w:bookmarkEnd w:id="49"/>
-    <w:bookmarkEnd w:id="50"/>
-    <w:bookmarkStart w:id="55" w:name="problem-23horner-方法比较"/>
+    <w:bookmarkEnd w:id="44"/>
+    <w:bookmarkEnd w:id="45"/>
+    <w:bookmarkStart w:id="49" w:name="problem-23horner-方法比较"/>
     <w:p>
       <w:pPr>
         <w:pStyle w:val="Heading2"/>
@@ -7176,7 +7066,7 @@
           <w:numId w:val="1006"/>
         </w:numPr>
       </w:pPr>
-      <w:hyperlink r:id="rId33">
+      <w:hyperlink r:id="rId30">
         <w:r>
           <w:rPr>
             <w:rStyle w:val="Hyperlink"/>
@@ -7200,7 +7090,7 @@
           <w:numId w:val="1006"/>
         </w:numPr>
       </w:pPr>
-      <w:hyperlink r:id="rId34">
+      <w:hyperlink r:id="rId31">
         <w:r>
           <w:rPr>
             <w:rStyle w:val="Hyperlink"/>
@@ -7209,7 +7099,7 @@
         </w:r>
       </w:hyperlink>
     </w:p>
-    <w:bookmarkStart w:id="51" w:name="待求问题-5"/>
+    <w:bookmarkStart w:id="46" w:name="待求问题-5"/>
     <w:p>
       <w:pPr>
         <w:pStyle w:val="Heading3"/>
@@ -7276,8 +7166,8 @@
         <w:t xml:space="preserve">邻域出现差异的原因。</w:t>
       </w:r>
     </w:p>
-    <w:bookmarkEnd w:id="51"/>
-    <w:bookmarkStart w:id="52" w:name="解决方式-5"/>
+    <w:bookmarkEnd w:id="46"/>
+    <w:bookmarkStart w:id="47" w:name="解决方式-5"/>
     <w:p>
       <w:pPr>
         <w:pStyle w:val="Heading3"/>
@@ -7475,8 +7365,8 @@
         <w:t xml:space="preserve">进一步统计最大误差、峰值位置与中位误差。</w:t>
       </w:r>
     </w:p>
-    <w:bookmarkEnd w:id="52"/>
-    <w:bookmarkStart w:id="53" w:name="问题答案-5"/>
+    <w:bookmarkEnd w:id="47"/>
+    <w:bookmarkStart w:id="48" w:name="答案-5"/>
     <w:p>
       <w:pPr>
         <w:pStyle w:val="Heading3"/>
@@ -7494,7 +7384,7 @@
         <w:rPr>
           <w:rFonts w:hint="eastAsia"/>
         </w:rPr>
-        <w:t xml:space="preserve">问题答案</w:t>
+        <w:t xml:space="preserve">答案</w:t>
       </w:r>
     </w:p>
     <w:p>
@@ -8040,31 +7930,9 @@
         <w:t xml:space="preserve">。</w:t>
       </w:r>
     </w:p>
-    <w:bookmarkEnd w:id="53"/>
-    <w:bookmarkStart w:id="54" w:name="分析-5"/>
-    <w:p>
-      <w:pPr>
-        <w:pStyle w:val="Heading3"/>
-      </w:pPr>
-      <w:r>
-        <w:rPr>
-          <w:rStyle w:val="SectionNumber"/>
-        </w:rPr>
-        <w:t xml:space="preserve">0.6.4</w:t>
-      </w:r>
-      <w:r>
-        <w:tab/>
-      </w:r>
-      <w:r>
-        <w:rPr>
-          <w:rFonts w:hint="eastAsia"/>
-        </w:rPr>
-        <w:t xml:space="preserve">分析</w:t>
-      </w:r>
-    </w:p>
-    <w:p>
-      <w:pPr>
-        <w:pStyle w:val="FirstParagraph"/>
+    <w:p>
+      <w:pPr>
+        <w:pStyle w:val="BodyText"/>
       </w:pPr>
       <w:r>
         <w:rPr>
@@ -8220,10 +8088,10 @@
         <w:t xml:space="preserve">，或在必须使用展开式时再引入补偿求和、局部重参数化等额外手段。</w:t>
       </w:r>
     </w:p>
-    <w:bookmarkEnd w:id="54"/>
-    <w:bookmarkEnd w:id="55"/>
-    <w:bookmarkEnd w:id="56"/>
-    <w:bookmarkStart w:id="77" w:name="iii.-half-precision-的机器精度与舍入误差"/>
+    <w:bookmarkEnd w:id="48"/>
+    <w:bookmarkEnd w:id="49"/>
+    <w:bookmarkEnd w:id="50"/>
+    <w:bookmarkStart w:id="67" w:name="iii.-half-precision-的机器精度与舍入误差"/>
     <w:p>
       <w:pPr>
         <w:pStyle w:val="Heading1"/>
@@ -8284,7 +8152,7 @@
         <w:t xml:space="preserve">作业要求完成以下两项工作：</w:t>
       </w:r>
     </w:p>
-    <w:bookmarkStart w:id="63" w:name="problem-31基本指标测量"/>
+    <w:bookmarkStart w:id="56" w:name="problem-31基本指标测量"/>
     <w:p>
       <w:pPr>
         <w:pStyle w:val="Heading2"/>
@@ -8327,7 +8195,7 @@
           <w:numId w:val="1007"/>
         </w:numPr>
       </w:pPr>
-      <w:hyperlink r:id="rId57">
+      <w:hyperlink r:id="rId51">
         <w:r>
           <w:rPr>
             <w:rStyle w:val="Hyperlink"/>
@@ -8351,7 +8219,7 @@
           <w:numId w:val="1007"/>
         </w:numPr>
       </w:pPr>
-      <w:hyperlink r:id="rId58">
+      <w:hyperlink r:id="rId52">
         <w:r>
           <w:rPr>
             <w:rStyle w:val="Hyperlink"/>
@@ -8360,7 +8228,7 @@
         </w:r>
       </w:hyperlink>
     </w:p>
-    <w:bookmarkStart w:id="59" w:name="待求问题-6"/>
+    <w:bookmarkStart w:id="53" w:name="待求问题-6"/>
     <w:p>
       <w:pPr>
         <w:pStyle w:val="Heading3"/>
@@ -8410,8 +8278,8 @@
         <w:t xml:space="preserve">precision、数值范围等基本指标。</w:t>
       </w:r>
     </w:p>
-    <w:bookmarkEnd w:id="59"/>
-    <w:bookmarkStart w:id="60" w:name="解决方式-6"/>
+    <w:bookmarkEnd w:id="53"/>
+    <w:bookmarkStart w:id="54" w:name="解决方式-6"/>
     <w:p>
       <w:pPr>
         <w:pStyle w:val="Heading3"/>
@@ -8624,8 +8492,8 @@
         <w:t xml:space="preserve">下的舍入误差放大现象。</w:t>
       </w:r>
     </w:p>
-    <w:bookmarkEnd w:id="60"/>
-    <w:bookmarkStart w:id="61" w:name="问题答案-6"/>
+    <w:bookmarkEnd w:id="54"/>
+    <w:bookmarkStart w:id="55" w:name="答案-6"/>
     <w:p>
       <w:pPr>
         <w:pStyle w:val="Heading3"/>
@@ -8643,7 +8511,7 @@
         <w:rPr>
           <w:rFonts w:hint="eastAsia"/>
         </w:rPr>
-        <w:t xml:space="preserve">问题答案</w:t>
+        <w:t xml:space="preserve">答案</w:t>
       </w:r>
     </w:p>
     <w:p>
@@ -8978,31 +8846,9 @@
         <w:t xml:space="preserve">格式。</w:t>
       </w:r>
     </w:p>
-    <w:bookmarkEnd w:id="61"/>
-    <w:bookmarkStart w:id="62" w:name="分析-6"/>
-    <w:p>
-      <w:pPr>
-        <w:pStyle w:val="Heading3"/>
-      </w:pPr>
-      <w:r>
-        <w:rPr>
-          <w:rStyle w:val="SectionNumber"/>
-        </w:rPr>
-        <w:t xml:space="preserve">0.7.4</w:t>
-      </w:r>
-      <w:r>
-        <w:tab/>
-      </w:r>
-      <w:r>
-        <w:rPr>
-          <w:rFonts w:hint="eastAsia"/>
-        </w:rPr>
-        <w:t xml:space="preserve">分析</w:t>
-      </w:r>
-    </w:p>
-    <w:p>
-      <w:pPr>
-        <w:pStyle w:val="FirstParagraph"/>
+    <w:p>
+      <w:pPr>
+        <w:pStyle w:val="BodyText"/>
       </w:pPr>
       <w:r>
         <w:t xml:space="preserve">half precision </w:t>
@@ -9160,9 +9006,9 @@
         <w:t xml:space="preserve">的舍入行为相一致。由此可见，在低精度格式中，算法结构往往比“理论等价”更重要；对含有相消项的表达式进行代数改写，是避免灾难性误差的关键手段。</w:t>
       </w:r>
     </w:p>
-    <w:bookmarkEnd w:id="62"/>
-    <w:bookmarkEnd w:id="63"/>
-    <w:bookmarkStart w:id="71" w:name="problem-32舍入误差算例"/>
+    <w:bookmarkEnd w:id="55"/>
+    <w:bookmarkEnd w:id="56"/>
+    <w:bookmarkStart w:id="63" w:name="problem-32舍入误差算例"/>
     <w:p>
       <w:pPr>
         <w:pStyle w:val="Heading2"/>
@@ -9205,7 +9051,7 @@
           <w:numId w:val="1008"/>
         </w:numPr>
       </w:pPr>
-      <w:hyperlink r:id="rId57">
+      <w:hyperlink r:id="rId51">
         <w:r>
           <w:rPr>
             <w:rStyle w:val="Hyperlink"/>
@@ -9229,7 +9075,7 @@
           <w:numId w:val="1008"/>
         </w:numPr>
       </w:pPr>
-      <w:hyperlink r:id="rId58">
+      <w:hyperlink r:id="rId52">
         <w:r>
           <w:rPr>
             <w:rStyle w:val="Hyperlink"/>
@@ -9238,7 +9084,7 @@
         </w:r>
       </w:hyperlink>
     </w:p>
-    <w:bookmarkStart w:id="64" w:name="待求问题-7"/>
+    <w:bookmarkStart w:id="57" w:name="待求问题-7"/>
     <w:p>
       <w:pPr>
         <w:pStyle w:val="Heading3"/>
@@ -9279,8 +9125,8 @@
         <w:t xml:space="preserve">可以严重到何种程度。</w:t>
       </w:r>
     </w:p>
-    <w:bookmarkEnd w:id="64"/>
-    <w:bookmarkStart w:id="65" w:name="解决方式-7"/>
+    <w:bookmarkEnd w:id="57"/>
+    <w:bookmarkStart w:id="58" w:name="解决方式-7"/>
     <w:p>
       <w:pPr>
         <w:pStyle w:val="Heading3"/>
@@ -9493,8 +9339,8 @@
         <w:t xml:space="preserve">下的舍入误差放大现象。</w:t>
       </w:r>
     </w:p>
-    <w:bookmarkEnd w:id="65"/>
-    <w:bookmarkStart w:id="69" w:name="问题答案-7"/>
+    <w:bookmarkEnd w:id="58"/>
+    <w:bookmarkStart w:id="62" w:name="答案-7"/>
     <w:p>
       <w:pPr>
         <w:pStyle w:val="Heading3"/>
@@ -9512,7 +9358,7 @@
         <w:rPr>
           <w:rFonts w:hint="eastAsia"/>
         </w:rPr>
-        <w:t xml:space="preserve">问题答案</w:t>
+        <w:t xml:space="preserve">答案</w:t>
       </w:r>
     </w:p>
     <w:p>
@@ -9709,25 +9555,271 @@
     </w:p>
     <w:p>
       <w:pPr>
+        <w:pStyle w:val="BodyText"/>
+      </w:pPr>
+      <w:r>
+        <w:rPr>
+          <w:rFonts w:hint="eastAsia"/>
+        </w:rPr>
+        <w:t xml:space="preserve">图中的跃变来自</w:t>
+      </w:r>
+      <w:r>
+        <w:t xml:space="preserve"> half precision </w:t>
+      </w:r>
+      <w:r>
+        <w:rPr>
+          <w:rFonts w:hint="eastAsia"/>
+        </w:rPr>
+        <w:t xml:space="preserve">的离散舍入阈值。</w:t>
+      </w:r>
+      <m:oMath>
+        <m:r>
+          <m:t>2</m:t>
+        </m:r>
+        <m:r>
+          <m:rPr>
+            <m:sty m:val="p"/>
+          </m:rPr>
+          <m:t>+</m:t>
+        </m:r>
+        <m:r>
+          <m:t>t</m:t>
+        </m:r>
+      </m:oMath>
+      <w:r>
+        <w:t xml:space="preserve"> </w:t>
+      </w:r>
+      <w:r>
+        <w:rPr>
+          <w:rFonts w:hint="eastAsia"/>
+        </w:rPr>
+        <w:t xml:space="preserve">在</w:t>
+      </w:r>
+      <w:r>
+        <w:t xml:space="preserve"> </w:t>
+      </w:r>
+      <m:oMath>
+        <m:r>
+          <m:t>t</m:t>
+        </m:r>
+        <m:r>
+          <m:rPr>
+            <m:sty m:val="p"/>
+          </m:rPr>
+          <m:t>≤</m:t>
+        </m:r>
+        <m:sSup>
+          <m:e>
+            <m:r>
+              <m:t>2</m:t>
+            </m:r>
+          </m:e>
+          <m:sup>
+            <m:r>
+              <m:rPr>
+                <m:sty m:val="p"/>
+              </m:rPr>
+              <m:t>−</m:t>
+            </m:r>
+            <m:r>
+              <m:t>10</m:t>
+            </m:r>
+          </m:sup>
+        </m:sSup>
+      </m:oMath>
+      <w:r>
+        <w:t xml:space="preserve"> </w:t>
+      </w:r>
+      <w:r>
+        <w:rPr>
+          <w:rFonts w:hint="eastAsia"/>
+        </w:rPr>
+        <w:t xml:space="preserve">时会被舍入到</w:t>
+      </w:r>
+      <w:r>
+        <w:t xml:space="preserve"> </w:t>
+      </w:r>
+      <m:oMath>
+        <m:r>
+          <m:t>2</m:t>
+        </m:r>
+      </m:oMath>
+      <w:r>
+        <w:rPr>
+          <w:rFonts w:hint="eastAsia"/>
+        </w:rPr>
+        <w:t xml:space="preserve">；直接表达式更敏感，因为</w:t>
+      </w:r>
+      <w:r>
+        <w:t xml:space="preserve"> </w:t>
+      </w:r>
+      <m:oMath>
+        <m:r>
+          <m:t>1</m:t>
+        </m:r>
+        <m:r>
+          <m:rPr>
+            <m:sty m:val="p"/>
+          </m:rPr>
+          <m:t>+</m:t>
+        </m:r>
+        <m:r>
+          <m:t>t</m:t>
+        </m:r>
+      </m:oMath>
+      <w:r>
+        <w:t xml:space="preserve"> </w:t>
+      </w:r>
+      <w:r>
+        <w:rPr>
+          <w:rFonts w:hint="eastAsia"/>
+        </w:rPr>
+        <w:t xml:space="preserve">在</w:t>
+      </w:r>
+      <w:r>
+        <w:t xml:space="preserve"> </w:t>
+      </w:r>
+      <m:oMath>
+        <m:r>
+          <m:t>t</m:t>
+        </m:r>
+        <m:r>
+          <m:rPr>
+            <m:sty m:val="p"/>
+          </m:rPr>
+          <m:t>≤</m:t>
+        </m:r>
+        <m:sSup>
+          <m:e>
+            <m:r>
+              <m:t>2</m:t>
+            </m:r>
+          </m:e>
+          <m:sup>
+            <m:r>
+              <m:rPr>
+                <m:sty m:val="p"/>
+              </m:rPr>
+              <m:t>−</m:t>
+            </m:r>
+            <m:r>
+              <m:t>11</m:t>
+            </m:r>
+          </m:sup>
+        </m:sSup>
+      </m:oMath>
+      <w:r>
+        <w:t xml:space="preserve"> </w:t>
+      </w:r>
+      <w:r>
+        <w:rPr>
+          <w:rFonts w:hint="eastAsia"/>
+        </w:rPr>
+        <w:t xml:space="preserve">时会先被舍入到</w:t>
+      </w:r>
+      <w:r>
+        <w:t xml:space="preserve"> </w:t>
+      </w:r>
+      <m:oMath>
+        <m:r>
+          <m:t>1</m:t>
+        </m:r>
+      </m:oMath>
+      <w:r>
+        <w:rPr>
+          <w:rFonts w:hint="eastAsia"/>
+        </w:rPr>
+        <w:t xml:space="preserve">，随后</w:t>
+      </w:r>
+      <w:r>
+        <w:t xml:space="preserve"> </w:t>
+      </w:r>
+      <m:oMath>
+        <m:r>
+          <m:rPr>
+            <m:sty m:val="p"/>
+          </m:rPr>
+          <m:t>(</m:t>
+        </m:r>
+        <m:r>
+          <m:t>1</m:t>
+        </m:r>
+        <m:r>
+          <m:rPr>
+            <m:sty m:val="p"/>
+          </m:rPr>
+          <m:t>+</m:t>
+        </m:r>
+        <m:r>
+          <m:t>t</m:t>
+        </m:r>
+        <m:sSup>
+          <m:e>
+            <m:r>
+              <m:rPr>
+                <m:sty m:val="p"/>
+              </m:rPr>
+              <m:t>)</m:t>
+            </m:r>
+          </m:e>
+          <m:sup>
+            <m:r>
+              <m:t>2</m:t>
+            </m:r>
+          </m:sup>
+        </m:sSup>
+        <m:r>
+          <m:rPr>
+            <m:sty m:val="p"/>
+          </m:rPr>
+          <m:t>−</m:t>
+        </m:r>
+        <m:r>
+          <m:t>1</m:t>
+        </m:r>
+      </m:oMath>
+      <w:r>
+        <w:t xml:space="preserve"> </w:t>
+      </w:r>
+      <w:r>
+        <w:rPr>
+          <w:rFonts w:hint="eastAsia"/>
+        </w:rPr>
+        <w:t xml:space="preserve">直接变为</w:t>
+      </w:r>
+      <w:r>
+        <w:t xml:space="preserve"> </w:t>
+      </w:r>
+      <m:oMath>
+        <m:r>
+          <m:t>0</m:t>
+        </m:r>
+      </m:oMath>
+      <w:r>
+        <w:t xml:space="preserve">。</w:t>
+      </w:r>
+    </w:p>
+    <w:p>
+      <w:pPr>
         <w:pStyle w:val="CaptionedFigure"/>
       </w:pPr>
       <w:r>
         <w:drawing>
           <wp:inline>
-            <wp:extent cx="4693920" cy="1805353"/>
+            <wp:extent cx="5120640" cy="5345917"/>
             <wp:effectExtent b="0" l="0" r="0" t="0"/>
-            <wp:docPr descr="Problem 3 roundoff comparison in half precision" title="" id="67" name="Picture"/>
+            <wp:docPr descr="Problem 3 roundoff comparison in half precision" title="" id="60" name="Picture"/>
             <a:graphic>
               <a:graphicData uri="http://schemas.openxmlformats.org/drawingml/2006/picture">
                 <pic:pic>
                   <pic:nvPicPr>
-                    <pic:cNvPr descr="../../result/problem3_roundoff.png" id="68" name="Picture"/>
+                    <pic:cNvPr descr="../../result/problem3_roundoff.png" id="61" name="Picture"/>
                     <pic:cNvPicPr>
                       <a:picLocks noChangeArrowheads="1" noChangeAspect="1"/>
                     </pic:cNvPicPr>
                   </pic:nvPicPr>
                   <pic:blipFill>
-                    <a:blip r:embed="rId66"/>
+                    <a:blip r:embed="rId59"/>
                     <a:stretch>
                       <a:fillRect/>
                     </a:stretch>
@@ -9735,7 +9827,7 @@
                   <pic:spPr bwMode="auto">
                     <a:xfrm>
                       <a:off x="0" y="0"/>
-                      <a:ext cx="4693920" cy="1805353"/>
+                      <a:ext cx="5120640" cy="5345917"/>
                     </a:xfrm>
                     <a:prstGeom prst="rect">
                       <a:avLst/>
@@ -9762,31 +9854,9 @@
         <w:t xml:space="preserve">Problem 3 roundoff comparison in half precision</w:t>
       </w:r>
     </w:p>
-    <w:bookmarkEnd w:id="69"/>
-    <w:bookmarkStart w:id="70" w:name="分析-7"/>
-    <w:p>
-      <w:pPr>
-        <w:pStyle w:val="Heading3"/>
-      </w:pPr>
-      <w:r>
-        <w:rPr>
-          <w:rStyle w:val="SectionNumber"/>
-        </w:rPr>
-        <w:t xml:space="preserve">0.8.4</w:t>
-      </w:r>
-      <w:r>
-        <w:tab/>
-      </w:r>
-      <w:r>
-        <w:rPr>
-          <w:rFonts w:hint="eastAsia"/>
-        </w:rPr>
-        <w:t xml:space="preserve">分析</w:t>
-      </w:r>
-    </w:p>
-    <w:p>
-      <w:pPr>
-        <w:pStyle w:val="FirstParagraph"/>
+    <w:p>
+      <w:pPr>
+        <w:pStyle w:val="BodyText"/>
       </w:pPr>
       <w:r>
         <w:t xml:space="preserve">half precision </w:t>
@@ -9800,43 +9870,118 @@
       <w:r>
         <w:t xml:space="preserve"> </w:t>
       </w:r>
-      <w:r>
-        <w:rPr>
-          <w:rStyle w:val="VerbatimChar"/>
-        </w:rPr>
-        <w:t xml:space="preserve">1</w:t>
-      </w:r>
-      <w:r>
-        <w:t xml:space="preserve"> </w:t>
-      </w:r>
-      <w:r>
-        <w:rPr>
-          <w:rFonts w:hint="eastAsia"/>
-        </w:rPr>
-        <w:t xml:space="preserve">附近的间隔约为</w:t>
-      </w:r>
-      <w:r>
-        <w:t xml:space="preserve"> </w:t>
-      </w:r>
-      <w:r>
-        <w:rPr>
-          <w:rStyle w:val="VerbatimChar"/>
-        </w:rPr>
-        <w:t xml:space="preserve">2^(-10)</w:t>
-      </w:r>
-      <w:r>
-        <w:rPr>
-          <w:rFonts w:hint="eastAsia"/>
-        </w:rPr>
-        <w:t xml:space="preserve">。当</w:t>
-      </w:r>
-      <w:r>
-        <w:t xml:space="preserve"> </w:t>
-      </w:r>
       <m:oMath>
         <m:r>
+          <m:t>1</m:t>
+        </m:r>
+      </m:oMath>
+      <w:r>
+        <w:t xml:space="preserve"> </w:t>
+      </w:r>
+      <w:r>
+        <w:rPr>
+          <w:rFonts w:hint="eastAsia"/>
+        </w:rPr>
+        <w:t xml:space="preserve">附近的相邻间隔为</w:t>
+      </w:r>
+      <w:r>
+        <w:t xml:space="preserve"> </w:t>
+      </w:r>
+      <m:oMath>
+        <m:sSup>
+          <m:e>
+            <m:r>
+              <m:t>2</m:t>
+            </m:r>
+          </m:e>
+          <m:sup>
+            <m:r>
+              <m:rPr>
+                <m:sty m:val="p"/>
+              </m:rPr>
+              <m:t>−</m:t>
+            </m:r>
+            <m:r>
+              <m:t>10</m:t>
+            </m:r>
+          </m:sup>
+        </m:sSup>
+      </m:oMath>
+      <w:r>
+        <w:rPr>
+          <w:rFonts w:hint="eastAsia"/>
+        </w:rPr>
+        <w:t xml:space="preserve">，最近舍入的半间隔为</w:t>
+      </w:r>
+      <w:r>
+        <w:t xml:space="preserve"> </w:t>
+      </w:r>
+      <m:oMath>
+        <m:sSup>
+          <m:e>
+            <m:r>
+              <m:t>2</m:t>
+            </m:r>
+          </m:e>
+          <m:sup>
+            <m:r>
+              <m:rPr>
+                <m:sty m:val="p"/>
+              </m:rPr>
+              <m:t>−</m:t>
+            </m:r>
+            <m:r>
+              <m:t>11</m:t>
+            </m:r>
+          </m:sup>
+        </m:sSup>
+      </m:oMath>
+      <w:r>
+        <w:rPr>
+          <w:rFonts w:hint="eastAsia"/>
+        </w:rPr>
+        <w:t xml:space="preserve">。因此当</w:t>
+      </w:r>
+      <w:r>
+        <w:t xml:space="preserve"> </w:t>
+      </w:r>
+      <m:oMath>
+        <m:r>
           <m:t>t</m:t>
         </m:r>
+        <m:r>
+          <m:rPr>
+            <m:sty m:val="p"/>
+          </m:rPr>
+          <m:t>=</m:t>
+        </m:r>
+        <m:sSup>
+          <m:e>
+            <m:r>
+              <m:t>2</m:t>
+            </m:r>
+          </m:e>
+          <m:sup>
+            <m:r>
+              <m:rPr>
+                <m:sty m:val="p"/>
+              </m:rPr>
+              <m:t>−</m:t>
+            </m:r>
+            <m:r>
+              <m:t>11</m:t>
+            </m:r>
+          </m:sup>
+        </m:sSup>
+        <m:r>
+          <m:rPr>
+            <m:sty m:val="p"/>
+          </m:rPr>
+          <m:t>=</m:t>
+        </m:r>
+        <m:r>
+          <m:t>0.00048828125</m:t>
+        </m:r>
       </m:oMath>
       <w:r>
         <w:t xml:space="preserve"> </w:t>
@@ -9845,32 +9990,39 @@
         <w:rPr>
           <w:rFonts w:hint="eastAsia"/>
         </w:rPr>
-        <w:t xml:space="preserve">小于或接近这一阈值时，</w:t>
-      </w:r>
-      <w:r>
-        <w:rPr>
-          <w:rStyle w:val="VerbatimChar"/>
-        </w:rPr>
-        <w:t xml:space="preserve">1+t</w:t>
-      </w:r>
-      <w:r>
-        <w:t xml:space="preserve"> </w:t>
-      </w:r>
-      <w:r>
-        <w:rPr>
-          <w:rFonts w:hint="eastAsia"/>
-        </w:rPr>
-        <w:t xml:space="preserve">将首先被舍入回</w:t>
-      </w:r>
-      <w:r>
-        <w:t xml:space="preserve"> </w:t>
-      </w:r>
-      <w:r>
-        <w:rPr>
-          <w:rStyle w:val="VerbatimChar"/>
-        </w:rPr>
-        <w:t xml:space="preserve">1</w:t>
-      </w:r>
+        <w:t xml:space="preserve">时，</w:t>
+      </w:r>
+      <m:oMath>
+        <m:r>
+          <m:t>1</m:t>
+        </m:r>
+        <m:r>
+          <m:rPr>
+            <m:sty m:val="p"/>
+          </m:rPr>
+          <m:t>+</m:t>
+        </m:r>
+        <m:r>
+          <m:t>t</m:t>
+        </m:r>
+      </m:oMath>
+      <w:r>
+        <w:t xml:space="preserve"> </w:t>
+      </w:r>
+      <w:r>
+        <w:rPr>
+          <w:rFonts w:hint="eastAsia"/>
+        </w:rPr>
+        <w:t xml:space="preserve">处在舍入边界并被舍入回</w:t>
+      </w:r>
+      <w:r>
+        <w:t xml:space="preserve"> </w:t>
+      </w:r>
+      <m:oMath>
+        <m:r>
+          <m:t>1</m:t>
+        </m:r>
+      </m:oMath>
       <w:r>
         <w:rPr>
           <w:rFonts w:hint="eastAsia"/>
@@ -9880,73 +10032,248 @@
       <w:r>
         <w:t xml:space="preserve"> </w:t>
       </w:r>
-      <w:r>
-        <w:rPr>
-          <w:rStyle w:val="VerbatimChar"/>
-        </w:rPr>
-        <w:t xml:space="preserve">(1+t)^2-1</w:t>
-      </w:r>
-      <w:r>
-        <w:t xml:space="preserve"> </w:t>
-      </w:r>
-      <w:r>
-        <w:rPr>
-          <w:rFonts w:hint="eastAsia"/>
-        </w:rPr>
-        <w:t xml:space="preserve">被舍入为</w:t>
-      </w:r>
-      <w:r>
-        <w:t xml:space="preserve"> </w:t>
-      </w:r>
-      <w:r>
-        <w:rPr>
-          <w:rStyle w:val="VerbatimChar"/>
-        </w:rPr>
-        <w:t xml:space="preserve">0</w:t>
-      </w:r>
-      <w:r>
-        <w:rPr>
-          <w:rFonts w:hint="eastAsia"/>
-        </w:rPr>
-        <w:t xml:space="preserve">。本题中的首个失真点正好出现在</w:t>
-      </w:r>
-      <w:r>
-        <w:t xml:space="preserve"> </w:t>
-      </w:r>
-      <w:r>
-        <w:rPr>
-          <w:rStyle w:val="VerbatimChar"/>
-        </w:rPr>
-        <w:t xml:space="preserve">t=0.00048828125</w:t>
-      </w:r>
-      <w:r>
-        <w:rPr>
-          <w:rFonts w:hint="eastAsia"/>
-        </w:rPr>
-        <w:t xml:space="preserve">，即</w:t>
-      </w:r>
-      <w:r>
-        <w:t xml:space="preserve"> machine epsilon </w:t>
-      </w:r>
-      <w:r>
-        <w:rPr>
-          <w:rFonts w:hint="eastAsia"/>
-        </w:rPr>
-        <w:t xml:space="preserve">的一半附近，这与</w:t>
-      </w:r>
-      <w:r>
-        <w:t xml:space="preserve"> binary16 </w:t>
-      </w:r>
-      <w:r>
-        <w:rPr>
-          <w:rFonts w:hint="eastAsia"/>
-        </w:rPr>
-        <w:t xml:space="preserve">的舍入行为相一致。由此可见，在低精度格式中，算法结构往往比“理论等价”更重要；对含有相消项的表达式进行代数改写，是避免灾难性误差的关键手段。</w:t>
-      </w:r>
-    </w:p>
-    <w:bookmarkEnd w:id="70"/>
-    <w:bookmarkEnd w:id="71"/>
-    <w:bookmarkStart w:id="76" w:name="problem-33误差严重程度结论"/>
+      <m:oMath>
+        <m:r>
+          <m:rPr>
+            <m:sty m:val="p"/>
+          </m:rPr>
+          <m:t>(</m:t>
+        </m:r>
+        <m:r>
+          <m:t>1</m:t>
+        </m:r>
+        <m:r>
+          <m:rPr>
+            <m:sty m:val="p"/>
+          </m:rPr>
+          <m:t>+</m:t>
+        </m:r>
+        <m:r>
+          <m:t>t</m:t>
+        </m:r>
+        <m:sSup>
+          <m:e>
+            <m:r>
+              <m:rPr>
+                <m:sty m:val="p"/>
+              </m:rPr>
+              <m:t>)</m:t>
+            </m:r>
+          </m:e>
+          <m:sup>
+            <m:r>
+              <m:t>2</m:t>
+            </m:r>
+          </m:sup>
+        </m:sSup>
+        <m:r>
+          <m:rPr>
+            <m:sty m:val="p"/>
+          </m:rPr>
+          <m:t>−</m:t>
+        </m:r>
+        <m:r>
+          <m:t>1</m:t>
+        </m:r>
+      </m:oMath>
+      <w:r>
+        <w:t xml:space="preserve"> </w:t>
+      </w:r>
+      <w:r>
+        <w:rPr>
+          <w:rFonts w:hint="eastAsia"/>
+        </w:rPr>
+        <w:t xml:space="preserve">变为</w:t>
+      </w:r>
+      <w:r>
+        <w:t xml:space="preserve"> </w:t>
+      </w:r>
+      <m:oMath>
+        <m:r>
+          <m:t>0</m:t>
+        </m:r>
+      </m:oMath>
+      <w:r>
+        <w:rPr>
+          <w:rFonts w:hint="eastAsia"/>
+        </w:rPr>
+        <w:t xml:space="preserve">，直接表达式的相对误差跃升到</w:t>
+      </w:r>
+      <w:r>
+        <w:t xml:space="preserve"> </w:t>
+      </w:r>
+      <w:r>
+        <w:rPr>
+          <w:rFonts w:hint="eastAsia"/>
+        </w:rPr>
+        <w:t xml:space="preserve">1.0000E+0。另一方面，</w:t>
+      </w:r>
+      <m:oMath>
+        <m:r>
+          <m:t>2</m:t>
+        </m:r>
+      </m:oMath>
+      <w:r>
+        <w:t xml:space="preserve"> </w:t>
+      </w:r>
+      <w:r>
+        <w:rPr>
+          <w:rFonts w:hint="eastAsia"/>
+        </w:rPr>
+        <w:t xml:space="preserve">附近的</w:t>
+      </w:r>
+      <w:r>
+        <w:t xml:space="preserve"> half </w:t>
+      </w:r>
+      <w:r>
+        <w:rPr>
+          <w:rFonts w:hint="eastAsia"/>
+        </w:rPr>
+        <w:t xml:space="preserve">间隔是</w:t>
+      </w:r>
+      <w:r>
+        <w:t xml:space="preserve"> </w:t>
+      </w:r>
+      <m:oMath>
+        <m:sSup>
+          <m:e>
+            <m:r>
+              <m:t>2</m:t>
+            </m:r>
+          </m:e>
+          <m:sup>
+            <m:r>
+              <m:rPr>
+                <m:sty m:val="p"/>
+              </m:rPr>
+              <m:t>−</m:t>
+            </m:r>
+            <m:r>
+              <m:t>9</m:t>
+            </m:r>
+          </m:sup>
+        </m:sSup>
+      </m:oMath>
+      <w:r>
+        <w:rPr>
+          <w:rFonts w:hint="eastAsia"/>
+        </w:rPr>
+        <w:t xml:space="preserve">，其半间隔是</w:t>
+      </w:r>
+      <w:r>
+        <w:t xml:space="preserve"> </w:t>
+      </w:r>
+      <m:oMath>
+        <m:sSup>
+          <m:e>
+            <m:r>
+              <m:t>2</m:t>
+            </m:r>
+          </m:e>
+          <m:sup>
+            <m:r>
+              <m:rPr>
+                <m:sty m:val="p"/>
+              </m:rPr>
+              <m:t>−</m:t>
+            </m:r>
+            <m:r>
+              <m:t>10</m:t>
+            </m:r>
+          </m:sup>
+        </m:sSup>
+      </m:oMath>
+      <w:r>
+        <w:rPr>
+          <w:rFonts w:hint="eastAsia"/>
+        </w:rPr>
+        <w:t xml:space="preserve">；所以</w:t>
+      </w:r>
+      <w:r>
+        <w:t xml:space="preserve"> </w:t>
+      </w:r>
+      <m:oMath>
+        <m:r>
+          <m:t>2</m:t>
+        </m:r>
+        <m:r>
+          <m:rPr>
+            <m:sty m:val="p"/>
+          </m:rPr>
+          <m:t>+</m:t>
+        </m:r>
+        <m:r>
+          <m:t>t</m:t>
+        </m:r>
+      </m:oMath>
+      <w:r>
+        <w:t xml:space="preserve"> </w:t>
+      </w:r>
+      <w:r>
+        <w:rPr>
+          <w:rFonts w:hint="eastAsia"/>
+        </w:rPr>
+        <w:t xml:space="preserve">的改写形式在</w:t>
+      </w:r>
+      <w:r>
+        <w:t xml:space="preserve"> </w:t>
+      </w:r>
+      <m:oMath>
+        <m:r>
+          <m:t>t</m:t>
+        </m:r>
+        <m:r>
+          <m:rPr>
+            <m:sty m:val="p"/>
+          </m:rPr>
+          <m:t>=</m:t>
+        </m:r>
+        <m:sSup>
+          <m:e>
+            <m:r>
+              <m:t>2</m:t>
+            </m:r>
+          </m:e>
+          <m:sup>
+            <m:r>
+              <m:rPr>
+                <m:sty m:val="p"/>
+              </m:rPr>
+              <m:t>−</m:t>
+            </m:r>
+            <m:r>
+              <m:t>10</m:t>
+            </m:r>
+          </m:sup>
+        </m:sSup>
+      </m:oMath>
+      <w:r>
+        <w:t xml:space="preserve"> </w:t>
+      </w:r>
+      <w:r>
+        <w:rPr>
+          <w:rFonts w:hint="eastAsia"/>
+        </w:rPr>
+        <w:t xml:space="preserve">开始被量化为</w:t>
+      </w:r>
+      <w:r>
+        <w:t xml:space="preserve"> </w:t>
+      </w:r>
+      <m:oMath>
+        <m:r>
+          <m:t>2</m:t>
+        </m:r>
+      </m:oMath>
+      <w:r>
+        <w:rPr>
+          <w:rFonts w:hint="eastAsia"/>
+        </w:rPr>
+        <w:t xml:space="preserve">，相对误差也会出现台阶。由此可见，图中的跃变是浮点量化阈值造成的确定性现象，不是随机噪声或绘图错误。</w:t>
+      </w:r>
+    </w:p>
+    <w:bookmarkEnd w:id="62"/>
+    <w:bookmarkEnd w:id="63"/>
+    <w:bookmarkStart w:id="66" w:name="problem-33误差严重程度结论"/>
     <w:p>
       <w:pPr>
         <w:pStyle w:val="Heading2"/>
@@ -9989,7 +10316,7 @@
           <w:numId w:val="1009"/>
         </w:numPr>
       </w:pPr>
-      <w:hyperlink r:id="rId57">
+      <w:hyperlink r:id="rId51">
         <w:r>
           <w:rPr>
             <w:rStyle w:val="Hyperlink"/>
@@ -10013,7 +10340,7 @@
           <w:numId w:val="1009"/>
         </w:numPr>
       </w:pPr>
-      <w:hyperlink r:id="rId58">
+      <w:hyperlink r:id="rId52">
         <w:r>
           <w:rPr>
             <w:rStyle w:val="Hyperlink"/>
@@ -10022,7 +10349,7 @@
         </w:r>
       </w:hyperlink>
     </w:p>
-    <w:bookmarkStart w:id="72" w:name="待求问题-8"/>
+    <w:bookmarkStart w:id="64" w:name="待求问题-8"/>
     <w:p>
       <w:pPr>
         <w:pStyle w:val="Heading3"/>
@@ -10081,8 +10408,8 @@
         <w:t xml:space="preserve">可达到的严重程度。</w:t>
       </w:r>
     </w:p>
-    <w:bookmarkEnd w:id="72"/>
-    <w:bookmarkStart w:id="73" w:name="解决方式-8"/>
+    <w:bookmarkEnd w:id="64"/>
+    <w:bookmarkStart w:id="65" w:name="答案-8"/>
     <w:p>
       <w:pPr>
         <w:pStyle w:val="Heading3"/>
@@ -10100,7 +10427,7 @@
         <w:rPr>
           <w:rFonts w:hint="eastAsia"/>
         </w:rPr>
-        <w:t xml:space="preserve">解决方式</w:t>
+        <w:t xml:space="preserve">答案</w:t>
       </w:r>
     </w:p>
     <w:p>
@@ -10111,133 +10438,112 @@
         <w:rPr>
           <w:rFonts w:hint="eastAsia"/>
         </w:rPr>
-        <w:t xml:space="preserve">本题采用的实验步骤可归纳为如下伪代码：</w:t>
-      </w:r>
-    </w:p>
-    <w:p>
-      <w:pPr>
-        <w:pStyle w:val="SourceCode"/>
-      </w:pPr>
-      <w:r>
-        <w:rPr>
-          <w:rStyle w:val="VerbatimChar"/>
-        </w:rPr>
-        <w:t xml:space="preserve">Input : half type h, parameter set T</w:t>
-      </w:r>
-      <w:r>
-        <w:br/>
-      </w:r>
-      <w:r>
-        <w:rPr>
-          <w:rStyle w:val="VerbatimChar"/>
-        </w:rPr>
-        <w:t xml:space="preserve">Output: metric table and roundoff plot</w:t>
-      </w:r>
-      <w:r>
-        <w:br/>
-      </w:r>
-      <w:r>
-        <w:br/>
-      </w:r>
-      <w:r>
-        <w:rPr>
-          <w:rStyle w:val="VerbatimChar"/>
-        </w:rPr>
-        <w:t xml:space="preserve">probe epsilon(h), min_normal(h)</w:t>
-      </w:r>
-      <w:r>
-        <w:br/>
-      </w:r>
-      <w:r>
-        <w:rPr>
-          <w:rStyle w:val="VerbatimChar"/>
-        </w:rPr>
-        <w:t xml:space="preserve">probe true_min(h), max_finite(h)</w:t>
-      </w:r>
-      <w:r>
-        <w:br/>
-      </w:r>
-      <w:r>
-        <w:br/>
-      </w:r>
-      <w:r>
-        <w:rPr>
-          <w:rStyle w:val="VerbatimChar"/>
-        </w:rPr>
-        <w:t xml:space="preserve">for each t in T do</w:t>
-      </w:r>
-      <w:r>
-        <w:br/>
-      </w:r>
-      <w:r>
-        <w:rPr>
-          <w:rStyle w:val="VerbatimChar"/>
-        </w:rPr>
-        <w:t xml:space="preserve">    y_dir &lt;- ((1 + t)^2 - 1) / t</w:t>
-      </w:r>
-      <w:r>
-        <w:br/>
-      </w:r>
-      <w:r>
-        <w:rPr>
-          <w:rStyle w:val="VerbatimChar"/>
-        </w:rPr>
-        <w:t xml:space="preserve">    y_alt &lt;- 2 + t</w:t>
-      </w:r>
-      <w:r>
-        <w:br/>
-      </w:r>
-      <w:r>
-        <w:rPr>
-          <w:rStyle w:val="VerbatimChar"/>
-        </w:rPr>
-        <w:t xml:space="preserve">    y_ref &lt;- high_precision(2 + t)</w:t>
-      </w:r>
-      <w:r>
-        <w:br/>
-      </w:r>
-      <w:r>
-        <w:rPr>
-          <w:rStyle w:val="VerbatimChar"/>
-        </w:rPr>
-        <w:t xml:space="preserve">    if y_ref != 0 then</w:t>
-      </w:r>
-      <w:r>
-        <w:br/>
-      </w:r>
-      <w:r>
-        <w:rPr>
-          <w:rStyle w:val="VerbatimChar"/>
-        </w:rPr>
-        <w:t xml:space="preserve">        err_dir &lt;- relerr(y_dir, y_ref)</w:t>
-      </w:r>
-      <w:r>
-        <w:br/>
-      </w:r>
-      <w:r>
-        <w:rPr>
-          <w:rStyle w:val="VerbatimChar"/>
-        </w:rPr>
-        <w:t xml:space="preserve">        err_alt &lt;- relerr(y_alt, y_ref)</w:t>
-      </w:r>
-      <w:r>
-        <w:br/>
-      </w:r>
-      <w:r>
-        <w:rPr>
-          <w:rStyle w:val="VerbatimChar"/>
-        </w:rPr>
-        <w:t xml:space="preserve">    end if</w:t>
-      </w:r>
-      <w:r>
-        <w:br/>
-      </w:r>
-      <w:r>
-        <w:rPr>
-          <w:rStyle w:val="VerbatimChar"/>
-        </w:rPr>
-        <w:t xml:space="preserve">end for</w:t>
-      </w:r>
+        <w:t xml:space="preserve">由前两问可直接得到结论：本机半精度的机器精度为</w:t>
+      </w:r>
+      <w:r>
+        <w:t xml:space="preserve"> </w:t>
+      </w:r>
+      <m:oMath>
+        <m:sSup>
+          <m:e>
+            <m:r>
+              <m:t>2</m:t>
+            </m:r>
+          </m:e>
+          <m:sup>
+            <m:r>
+              <m:rPr>
+                <m:sty m:val="p"/>
+              </m:rPr>
+              <m:t>−</m:t>
+            </m:r>
+            <m:r>
+              <m:t>10</m:t>
+            </m:r>
+          </m:sup>
+        </m:sSup>
+        <m:r>
+          <m:rPr>
+            <m:sty m:val="p"/>
+          </m:rPr>
+          <m:t>=</m:t>
+        </m:r>
+        <m:r>
+          <m:t>0.0009765625</m:t>
+        </m:r>
+      </m:oMath>
+      <w:r>
+        <w:rPr>
+          <w:rFonts w:hint="eastAsia"/>
+        </w:rPr>
+        <w:t xml:space="preserve">。在算例</w:t>
+      </w:r>
+    </w:p>
+    <w:p>
+      <w:pPr>
+        <w:pStyle w:val="BodyText"/>
+      </w:pPr>
+      <m:oMathPara>
+        <m:oMathParaPr>
+          <m:jc m:val="center"/>
+        </m:oMathParaPr>
+        <m:oMath>
+          <m:f>
+            <m:fPr>
+              <m:type m:val="bar"/>
+            </m:fPr>
+            <m:num>
+              <m:r>
+                <m:rPr>
+                  <m:sty m:val="p"/>
+                </m:rPr>
+                <m:t>(</m:t>
+              </m:r>
+              <m:r>
+                <m:t>1</m:t>
+              </m:r>
+              <m:r>
+                <m:rPr>
+                  <m:sty m:val="p"/>
+                </m:rPr>
+                <m:t>+</m:t>
+              </m:r>
+              <m:r>
+                <m:t>t</m:t>
+              </m:r>
+              <m:sSup>
+                <m:e>
+                  <m:r>
+                    <m:rPr>
+                      <m:sty m:val="p"/>
+                    </m:rPr>
+                    <m:t>)</m:t>
+                  </m:r>
+                </m:e>
+                <m:sup>
+                  <m:r>
+                    <m:t>2</m:t>
+                  </m:r>
+                </m:sup>
+              </m:sSup>
+              <m:r>
+                <m:rPr>
+                  <m:sty m:val="p"/>
+                </m:rPr>
+                <m:t>−</m:t>
+              </m:r>
+              <m:r>
+                <m:t>1</m:t>
+              </m:r>
+            </m:num>
+            <m:den>
+              <m:r>
+                <m:t>t</m:t>
+              </m:r>
+            </m:den>
+          </m:f>
+        </m:oMath>
+      </m:oMathPara>
     </w:p>
     <w:p>
       <w:pPr>
@@ -10247,43 +10553,169 @@
         <w:rPr>
           <w:rFonts w:hint="eastAsia"/>
         </w:rPr>
-        <w:t xml:space="preserve">通过比较</w:t>
-      </w:r>
-      <w:r>
-        <w:t xml:space="preserve"> </w:t>
-      </w:r>
-      <w:r>
-        <w:rPr>
-          <w:rStyle w:val="VerbatimChar"/>
-        </w:rPr>
-        <w:t xml:space="preserve">y_dir</w:t>
-      </w:r>
-      <w:r>
-        <w:t xml:space="preserve"> </w:t>
-      </w:r>
-      <w:r>
-        <w:rPr>
-          <w:rFonts w:hint="eastAsia"/>
-        </w:rPr>
-        <w:t xml:space="preserve">与</w:t>
-      </w:r>
-      <w:r>
-        <w:t xml:space="preserve"> </w:t>
-      </w:r>
-      <w:r>
-        <w:rPr>
-          <w:rStyle w:val="VerbatimChar"/>
-        </w:rPr>
-        <w:t xml:space="preserve">y_alt</w:t>
-      </w:r>
-      <w:r>
-        <w:t xml:space="preserve"> </w:t>
-      </w:r>
-      <w:r>
-        <w:rPr>
-          <w:rFonts w:hint="eastAsia"/>
-        </w:rPr>
-        <w:t xml:space="preserve">的误差变化，可直接观察</w:t>
+        <w:t xml:space="preserve">中，当</w:t>
+      </w:r>
+      <w:r>
+        <w:t xml:space="preserve"> </w:t>
+      </w:r>
+      <m:oMath>
+        <m:r>
+          <m:t>t</m:t>
+        </m:r>
+        <m:r>
+          <m:rPr>
+            <m:sty m:val="p"/>
+          </m:rPr>
+          <m:t>=</m:t>
+        </m:r>
+        <m:sSup>
+          <m:e>
+            <m:r>
+              <m:t>2</m:t>
+            </m:r>
+          </m:e>
+          <m:sup>
+            <m:r>
+              <m:rPr>
+                <m:sty m:val="p"/>
+              </m:rPr>
+              <m:t>−</m:t>
+            </m:r>
+            <m:r>
+              <m:t>11</m:t>
+            </m:r>
+          </m:sup>
+        </m:sSup>
+        <m:r>
+          <m:rPr>
+            <m:sty m:val="p"/>
+          </m:rPr>
+          <m:t>=</m:t>
+        </m:r>
+        <m:r>
+          <m:t>0.00048828125</m:t>
+        </m:r>
+      </m:oMath>
+      <w:r>
+        <w:t xml:space="preserve"> </w:t>
+      </w:r>
+      <w:r>
+        <w:rPr>
+          <w:rFonts w:hint="eastAsia"/>
+        </w:rPr>
+        <w:t xml:space="preserve">时，半精度直接计算结果为</w:t>
+      </w:r>
+      <w:r>
+        <w:t xml:space="preserve"> </w:t>
+      </w:r>
+      <m:oMath>
+        <m:r>
+          <m:t>0</m:t>
+        </m:r>
+      </m:oMath>
+      <w:r>
+        <w:rPr>
+          <w:rFonts w:hint="eastAsia"/>
+        </w:rPr>
+        <w:t xml:space="preserve">，而精确值仍为</w:t>
+      </w:r>
+      <w:r>
+        <w:t xml:space="preserve"> </w:t>
+      </w:r>
+      <m:oMath>
+        <m:r>
+          <m:t>2.00048828125</m:t>
+        </m:r>
+      </m:oMath>
+      <w:r>
+        <w:rPr>
+          <w:rFonts w:hint="eastAsia"/>
+        </w:rPr>
+        <w:t xml:space="preserve">，相对误差达到</w:t>
+      </w:r>
+      <w:r>
+        <w:t xml:space="preserve"> </w:t>
+      </w:r>
+      <w:r>
+        <w:rPr>
+          <w:rFonts w:hint="eastAsia"/>
+        </w:rPr>
+        <w:t xml:space="preserve">1.0000E+0。也就是说，half</w:t>
+      </w:r>
+      <w:r>
+        <w:t xml:space="preserve"> precision </w:t>
+      </w:r>
+      <w:r>
+        <w:rPr>
+          <w:rFonts w:hint="eastAsia"/>
+        </w:rPr>
+        <w:t xml:space="preserve">下的</w:t>
+      </w:r>
+      <w:r>
+        <w:t xml:space="preserve"> roundoff error </w:t>
+      </w:r>
+      <w:r>
+        <w:rPr>
+          <w:rFonts w:hint="eastAsia"/>
+        </w:rPr>
+        <w:t xml:space="preserve">可以严重到把本应为</w:t>
+      </w:r>
+      <w:r>
+        <w:t xml:space="preserve"> </w:t>
+      </w:r>
+      <m:oMath>
+        <m:r>
+          <m:t>2</m:t>
+        </m:r>
+      </m:oMath>
+      <w:r>
+        <w:t xml:space="preserve"> </w:t>
+      </w:r>
+      <w:r>
+        <w:rPr>
+          <w:rFonts w:hint="eastAsia"/>
+        </w:rPr>
+        <w:t xml:space="preserve">量级的结果直接压成</w:t>
+      </w:r>
+      <w:r>
+        <w:t xml:space="preserve"> </w:t>
+      </w:r>
+      <m:oMath>
+        <m:r>
+          <m:t>0</m:t>
+        </m:r>
+      </m:oMath>
+      <w:r>
+        <w:t xml:space="preserve">。</w:t>
+      </w:r>
+    </w:p>
+    <w:p>
+      <w:pPr>
+        <w:pStyle w:val="BodyText"/>
+      </w:pPr>
+      <w:r>
+        <w:rPr>
+          <w:rFonts w:hint="eastAsia"/>
+        </w:rPr>
+        <w:t xml:space="preserve">该结论直接由</w:t>
+      </w:r>
+      <w:r>
+        <w:t xml:space="preserve"> Problem 3(1) </w:t>
+      </w:r>
+      <w:r>
+        <w:rPr>
+          <w:rFonts w:hint="eastAsia"/>
+        </w:rPr>
+        <w:t xml:space="preserve">和</w:t>
+      </w:r>
+      <w:r>
+        <w:t xml:space="preserve"> Problem 3(2) </w:t>
+      </w:r>
+      <w:r>
+        <w:rPr>
+          <w:rFonts w:hint="eastAsia"/>
+        </w:rPr>
+        <w:t xml:space="preserve">的结果归纳得到。核心事实是</w:t>
       </w:r>
       <w:r>
         <w:t xml:space="preserve"> half precision </w:t>
@@ -10292,290 +10724,253 @@
         <w:rPr>
           <w:rFonts w:hint="eastAsia"/>
         </w:rPr>
-        <w:t xml:space="preserve">下的舍入误差放大现象。</w:t>
-      </w:r>
-    </w:p>
-    <w:bookmarkEnd w:id="73"/>
-    <w:bookmarkStart w:id="74" w:name="问题答案-8"/>
-    <w:p>
-      <w:pPr>
-        <w:pStyle w:val="Heading3"/>
-      </w:pPr>
-      <w:r>
-        <w:rPr>
-          <w:rStyle w:val="SectionNumber"/>
-        </w:rPr>
-        <w:t xml:space="preserve">0.9.3</w:t>
-      </w:r>
-      <w:r>
-        <w:tab/>
-      </w:r>
-      <w:r>
-        <w:rPr>
-          <w:rFonts w:hint="eastAsia"/>
-        </w:rPr>
-        <w:t xml:space="preserve">问题答案</w:t>
-      </w:r>
-    </w:p>
-    <w:p>
-      <w:pPr>
-        <w:pStyle w:val="FirstParagraph"/>
-      </w:pPr>
-      <w:r>
-        <w:rPr>
-          <w:rFonts w:hint="eastAsia"/>
-        </w:rPr>
-        <w:t xml:space="preserve">因此，half</w:t>
-      </w:r>
-      <w:r>
-        <w:t xml:space="preserve"> precision </w:t>
-      </w:r>
-      <w:r>
-        <w:rPr>
-          <w:rFonts w:hint="eastAsia"/>
-        </w:rPr>
-        <w:t xml:space="preserve">的</w:t>
-      </w:r>
-      <w:r>
-        <w:t xml:space="preserve"> machine epsilon </w:t>
-      </w:r>
-      <w:r>
-        <w:rPr>
-          <w:rFonts w:hint="eastAsia"/>
-        </w:rPr>
-        <w:t xml:space="preserve">约为</w:t>
-      </w:r>
-      <w:r>
-        <w:t xml:space="preserve"> </w:t>
-      </w:r>
-      <w:r>
-        <w:rPr>
-          <w:rStyle w:val="VerbatimChar"/>
-        </w:rPr>
-        <w:t xml:space="preserve">2^(-10)</w:t>
-      </w:r>
-      <w:r>
-        <w:rPr>
-          <w:rFonts w:hint="eastAsia"/>
-        </w:rPr>
-        <w:t xml:space="preserve">，有效数字极为有限；一旦表达式包含相消运算，舍入误差完全可能将本应处于</w:t>
-      </w:r>
-      <w:r>
-        <w:t xml:space="preserve"> </w:t>
-      </w:r>
-      <w:r>
-        <w:rPr>
-          <w:rStyle w:val="VerbatimChar"/>
-        </w:rPr>
-        <w:t xml:space="preserve">2</w:t>
-      </w:r>
-      <w:r>
-        <w:t xml:space="preserve"> </w:t>
-      </w:r>
-      <w:r>
-        <w:rPr>
-          <w:rFonts w:hint="eastAsia"/>
-        </w:rPr>
-        <w:t xml:space="preserve">量级的结果直接压缩为</w:t>
-      </w:r>
-      <w:r>
-        <w:t xml:space="preserve"> </w:t>
-      </w:r>
-      <w:r>
-        <w:rPr>
-          <w:rStyle w:val="VerbatimChar"/>
-        </w:rPr>
-        <w:t xml:space="preserve">0</w:t>
-      </w:r>
+        <w:t xml:space="preserve">在</w:t>
+      </w:r>
+      <w:r>
+        <w:t xml:space="preserve"> </w:t>
+      </w:r>
+      <m:oMath>
+        <m:r>
+          <m:t>1</m:t>
+        </m:r>
+      </m:oMath>
+      <w:r>
+        <w:t xml:space="preserve"> </w:t>
+      </w:r>
+      <w:r>
+        <w:rPr>
+          <w:rFonts w:hint="eastAsia"/>
+        </w:rPr>
+        <w:t xml:space="preserve">附近只有约</w:t>
+      </w:r>
+      <w:r>
+        <w:t xml:space="preserve"> </w:t>
+      </w:r>
+      <m:oMath>
+        <m:sSup>
+          <m:e>
+            <m:r>
+              <m:t>2</m:t>
+            </m:r>
+          </m:e>
+          <m:sup>
+            <m:r>
+              <m:rPr>
+                <m:sty m:val="p"/>
+              </m:rPr>
+              <m:t>−</m:t>
+            </m:r>
+            <m:r>
+              <m:t>10</m:t>
+            </m:r>
+          </m:sup>
+        </m:sSup>
+      </m:oMath>
+      <w:r>
+        <w:t xml:space="preserve"> </w:t>
+      </w:r>
+      <w:r>
+        <w:rPr>
+          <w:rFonts w:hint="eastAsia"/>
+        </w:rPr>
+        <w:t xml:space="preserve">的相邻分辨率，因此</w:t>
+      </w:r>
+      <w:r>
+        <w:t xml:space="preserve"> </w:t>
+      </w:r>
+      <m:oMath>
+        <m:r>
+          <m:t>1</m:t>
+        </m:r>
+        <m:r>
+          <m:rPr>
+            <m:sty m:val="p"/>
+          </m:rPr>
+          <m:t>+</m:t>
+        </m:r>
+        <m:r>
+          <m:t>t</m:t>
+        </m:r>
+      </m:oMath>
+      <w:r>
+        <w:t xml:space="preserve"> </w:t>
+      </w:r>
+      <w:r>
+        <w:rPr>
+          <w:rFonts w:hint="eastAsia"/>
+        </w:rPr>
+        <w:t xml:space="preserve">对小扰动并不连续响应；当</w:t>
+      </w:r>
+      <w:r>
+        <w:t xml:space="preserve"> </w:t>
+      </w:r>
+      <m:oMath>
+        <m:r>
+          <m:t>t</m:t>
+        </m:r>
+      </m:oMath>
+      <w:r>
+        <w:t xml:space="preserve"> </w:t>
+      </w:r>
+      <w:r>
+        <w:rPr>
+          <w:rFonts w:hint="eastAsia"/>
+        </w:rPr>
+        <w:t xml:space="preserve">落到半间隔</w:t>
+      </w:r>
+      <w:r>
+        <w:t xml:space="preserve"> </w:t>
+      </w:r>
+      <m:oMath>
+        <m:sSup>
+          <m:e>
+            <m:r>
+              <m:t>2</m:t>
+            </m:r>
+          </m:e>
+          <m:sup>
+            <m:r>
+              <m:rPr>
+                <m:sty m:val="p"/>
+              </m:rPr>
+              <m:t>−</m:t>
+            </m:r>
+            <m:r>
+              <m:t>11</m:t>
+            </m:r>
+          </m:sup>
+        </m:sSup>
+      </m:oMath>
+      <w:r>
+        <w:t xml:space="preserve"> </w:t>
+      </w:r>
+      <w:r>
+        <w:rPr>
+          <w:rFonts w:hint="eastAsia"/>
+        </w:rPr>
+        <w:t xml:space="preserve">附近时，直接表达式会先把</w:t>
+      </w:r>
+      <w:r>
+        <w:t xml:space="preserve"> </w:t>
+      </w:r>
+      <m:oMath>
+        <m:r>
+          <m:t>1</m:t>
+        </m:r>
+        <m:r>
+          <m:rPr>
+            <m:sty m:val="p"/>
+          </m:rPr>
+          <m:t>+</m:t>
+        </m:r>
+        <m:r>
+          <m:t>t</m:t>
+        </m:r>
+      </m:oMath>
+      <w:r>
+        <w:t xml:space="preserve"> </w:t>
+      </w:r>
+      <w:r>
+        <w:rPr>
+          <w:rFonts w:hint="eastAsia"/>
+        </w:rPr>
+        <w:t xml:space="preserve">舍入回</w:t>
+      </w:r>
+      <w:r>
+        <w:t xml:space="preserve"> </w:t>
+      </w:r>
+      <m:oMath>
+        <m:r>
+          <m:t>1</m:t>
+        </m:r>
+      </m:oMath>
+      <w:r>
+        <w:rPr>
+          <w:rFonts w:hint="eastAsia"/>
+        </w:rPr>
+        <w:t xml:space="preserve">，再把整个分子压成</w:t>
+      </w:r>
+      <w:r>
+        <w:t xml:space="preserve"> </w:t>
+      </w:r>
+      <m:oMath>
+        <m:r>
+          <m:t>0</m:t>
+        </m:r>
+      </m:oMath>
+      <w:r>
+        <w:rPr>
+          <w:rFonts w:hint="eastAsia"/>
+        </w:rPr>
+        <w:t xml:space="preserve">。改写为</w:t>
+      </w:r>
+      <w:r>
+        <w:t xml:space="preserve"> </w:t>
+      </w:r>
+      <m:oMath>
+        <m:r>
+          <m:t>2</m:t>
+        </m:r>
+        <m:r>
+          <m:rPr>
+            <m:sty m:val="p"/>
+          </m:rPr>
+          <m:t>+</m:t>
+        </m:r>
+        <m:r>
+          <m:t>t</m:t>
+        </m:r>
+      </m:oMath>
+      <w:r>
+        <w:t xml:space="preserve"> </w:t>
+      </w:r>
+      <w:r>
+        <w:rPr>
+          <w:rFonts w:hint="eastAsia"/>
+        </w:rPr>
+        <w:t xml:space="preserve">后仍有</w:t>
+      </w:r>
+      <w:r>
+        <w:t xml:space="preserve"> half </w:t>
+      </w:r>
+      <w:r>
+        <w:rPr>
+          <w:rFonts w:hint="eastAsia"/>
+        </w:rPr>
+        <w:t xml:space="preserve">量化误差，但不会把结果从</w:t>
+      </w:r>
+      <w:r>
+        <w:t xml:space="preserve"> </w:t>
+      </w:r>
+      <m:oMath>
+        <m:r>
+          <m:t>2</m:t>
+        </m:r>
+      </m:oMath>
+      <w:r>
+        <w:t xml:space="preserve"> </w:t>
+      </w:r>
+      <w:r>
+        <w:rPr>
+          <w:rFonts w:hint="eastAsia"/>
+        </w:rPr>
+        <w:t xml:space="preserve">量级直接压到</w:t>
+      </w:r>
+      <w:r>
+        <w:t xml:space="preserve"> </w:t>
+      </w:r>
+      <m:oMath>
+        <m:r>
+          <m:t>0</m:t>
+        </m:r>
+      </m:oMath>
       <w:r>
         <w:t xml:space="preserve">。</w:t>
       </w:r>
     </w:p>
-    <w:bookmarkEnd w:id="74"/>
-    <w:bookmarkStart w:id="75" w:name="分析-8"/>
-    <w:p>
-      <w:pPr>
-        <w:pStyle w:val="Heading3"/>
-      </w:pPr>
-      <w:r>
-        <w:rPr>
-          <w:rStyle w:val="SectionNumber"/>
-        </w:rPr>
-        <w:t xml:space="preserve">0.9.4</w:t>
-      </w:r>
-      <w:r>
-        <w:tab/>
-      </w:r>
-      <w:r>
-        <w:rPr>
-          <w:rFonts w:hint="eastAsia"/>
-        </w:rPr>
-        <w:t xml:space="preserve">分析</w:t>
-      </w:r>
-    </w:p>
-    <w:p>
-      <w:pPr>
-        <w:pStyle w:val="FirstParagraph"/>
-      </w:pPr>
-      <w:r>
-        <w:t xml:space="preserve">half precision </w:t>
-      </w:r>
-      <w:r>
-        <w:rPr>
-          <w:rFonts w:hint="eastAsia"/>
-        </w:rPr>
-        <w:t xml:space="preserve">在</w:t>
-      </w:r>
-      <w:r>
-        <w:t xml:space="preserve"> </w:t>
-      </w:r>
-      <w:r>
-        <w:rPr>
-          <w:rStyle w:val="VerbatimChar"/>
-        </w:rPr>
-        <w:t xml:space="preserve">1</w:t>
-      </w:r>
-      <w:r>
-        <w:t xml:space="preserve"> </w:t>
-      </w:r>
-      <w:r>
-        <w:rPr>
-          <w:rFonts w:hint="eastAsia"/>
-        </w:rPr>
-        <w:t xml:space="preserve">附近的间隔约为</w:t>
-      </w:r>
-      <w:r>
-        <w:t xml:space="preserve"> </w:t>
-      </w:r>
-      <w:r>
-        <w:rPr>
-          <w:rStyle w:val="VerbatimChar"/>
-        </w:rPr>
-        <w:t xml:space="preserve">2^(-10)</w:t>
-      </w:r>
-      <w:r>
-        <w:rPr>
-          <w:rFonts w:hint="eastAsia"/>
-        </w:rPr>
-        <w:t xml:space="preserve">。当</w:t>
-      </w:r>
-      <w:r>
-        <w:t xml:space="preserve"> </w:t>
-      </w:r>
-      <m:oMath>
-        <m:r>
-          <m:t>t</m:t>
-        </m:r>
-      </m:oMath>
-      <w:r>
-        <w:t xml:space="preserve"> </w:t>
-      </w:r>
-      <w:r>
-        <w:rPr>
-          <w:rFonts w:hint="eastAsia"/>
-        </w:rPr>
-        <w:t xml:space="preserve">小于或接近这一阈值时，</w:t>
-      </w:r>
-      <w:r>
-        <w:rPr>
-          <w:rStyle w:val="VerbatimChar"/>
-        </w:rPr>
-        <w:t xml:space="preserve">1+t</w:t>
-      </w:r>
-      <w:r>
-        <w:t xml:space="preserve"> </w:t>
-      </w:r>
-      <w:r>
-        <w:rPr>
-          <w:rFonts w:hint="eastAsia"/>
-        </w:rPr>
-        <w:t xml:space="preserve">将首先被舍入回</w:t>
-      </w:r>
-      <w:r>
-        <w:t xml:space="preserve"> </w:t>
-      </w:r>
-      <w:r>
-        <w:rPr>
-          <w:rStyle w:val="VerbatimChar"/>
-        </w:rPr>
-        <w:t xml:space="preserve">1</w:t>
-      </w:r>
-      <w:r>
-        <w:rPr>
-          <w:rFonts w:hint="eastAsia"/>
-        </w:rPr>
-        <w:t xml:space="preserve">，进而使</w:t>
-      </w:r>
-      <w:r>
-        <w:t xml:space="preserve"> </w:t>
-      </w:r>
-      <w:r>
-        <w:rPr>
-          <w:rStyle w:val="VerbatimChar"/>
-        </w:rPr>
-        <w:t xml:space="preserve">(1+t)^2-1</w:t>
-      </w:r>
-      <w:r>
-        <w:t xml:space="preserve"> </w:t>
-      </w:r>
-      <w:r>
-        <w:rPr>
-          <w:rFonts w:hint="eastAsia"/>
-        </w:rPr>
-        <w:t xml:space="preserve">被舍入为</w:t>
-      </w:r>
-      <w:r>
-        <w:t xml:space="preserve"> </w:t>
-      </w:r>
-      <w:r>
-        <w:rPr>
-          <w:rStyle w:val="VerbatimChar"/>
-        </w:rPr>
-        <w:t xml:space="preserve">0</w:t>
-      </w:r>
-      <w:r>
-        <w:rPr>
-          <w:rFonts w:hint="eastAsia"/>
-        </w:rPr>
-        <w:t xml:space="preserve">。本题中的首个失真点正好出现在</w:t>
-      </w:r>
-      <w:r>
-        <w:t xml:space="preserve"> </w:t>
-      </w:r>
-      <w:r>
-        <w:rPr>
-          <w:rStyle w:val="VerbatimChar"/>
-        </w:rPr>
-        <w:t xml:space="preserve">t=0.00048828125</w:t>
-      </w:r>
-      <w:r>
-        <w:rPr>
-          <w:rFonts w:hint="eastAsia"/>
-        </w:rPr>
-        <w:t xml:space="preserve">，即</w:t>
-      </w:r>
-      <w:r>
-        <w:t xml:space="preserve"> machine epsilon </w:t>
-      </w:r>
-      <w:r>
-        <w:rPr>
-          <w:rFonts w:hint="eastAsia"/>
-        </w:rPr>
-        <w:t xml:space="preserve">的一半附近，这与</w:t>
-      </w:r>
-      <w:r>
-        <w:t xml:space="preserve"> binary16 </w:t>
-      </w:r>
-      <w:r>
-        <w:rPr>
-          <w:rFonts w:hint="eastAsia"/>
-        </w:rPr>
-        <w:t xml:space="preserve">的舍入行为相一致。由此可见，在低精度格式中，算法结构往往比“理论等价”更重要；对含有相消项的表达式进行代数改写，是避免灾难性误差的关键手段。</w:t>
-      </w:r>
-    </w:p>
-    <w:bookmarkEnd w:id="75"/>
-    <w:bookmarkEnd w:id="76"/>
-    <w:bookmarkEnd w:id="77"/>
+    <w:bookmarkEnd w:id="65"/>
+    <w:bookmarkEnd w:id="66"/>
+    <w:bookmarkEnd w:id="67"/>
     <w:sectPr>
       <w:footnotePr>
         <w:numRestart w:val="eachSect"/>

</xml_diff>